<commit_message>
Deploying to gh-pages from @ nlmixr2/monolix2rx@aa66b013b09d97e23071286ea32221f49db12c56 🚀
</commit_message>
<xml_diff>
--- a/articles/mod-Word.docx
+++ b/articles/mod-Word.docx
@@ -2379,7 +2379,7 @@
         </w:rPr>
         <w:t xml:space="preserve">Table </w:t>
       </w:r>
-      <w:bookmarkStart w:id="6e075395-79e8-43bc-a0da-ba2ed19cc3ba" w:name="pest_table"/>
+      <w:bookmarkStart w:id="d12f04ff-430e-44d7-86ec-6c4bfcbd1a0d" w:name="pest_table"/>
       <w:r>
         <w:rPr/>
         <w:t xml:space="preserve"/>
@@ -2400,7 +2400,7 @@
         <w:rPr/>
         <w:t xml:space="preserve"/>
       </w:r>
-      <w:bookmarkEnd w:id="6e075395-79e8-43bc-a0da-ba2ed19cc3ba"/>
+      <w:bookmarkEnd w:id="d12f04ff-430e-44d7-86ec-6c4bfcbd1a0d"/>
       <w:r>
         <w:rPr>
           <w:rFonts/>
@@ -2496,7 +2496,7 @@
         </w:rPr>
         <w:t xml:space="preserve">Figure </w:t>
       </w:r>
-      <w:bookmarkStart w:id="cd0c911d-e288-4377-80da-5cba94b08a11" w:name="ind_plots"/>
+      <w:bookmarkStart w:id="918a34c2-aa4a-4048-a037-a13b1fc554b2" w:name="ind_plots"/>
       <w:r>
         <w:rPr/>
         <w:t xml:space="preserve"/>
@@ -2517,7 +2517,7 @@
         <w:rPr/>
         <w:t xml:space="preserve"/>
       </w:r>
-      <w:bookmarkEnd w:id="cd0c911d-e288-4377-80da-5cba94b08a11"/>
+      <w:bookmarkEnd w:id="918a34c2-aa4a-4048-a037-a13b1fc554b2"/>
       <w:r>
         <w:rPr>
           <w:rFonts/>
@@ -2599,7 +2599,7 @@
         </w:rPr>
         <w:t xml:space="preserve">Figure </w:t>
       </w:r>
-      <w:bookmarkStart w:id="a7a2d02c-53ed-4d7e-9acd-0bff3ac1b12e" w:name="dv_vs_pred_ipred"/>
+      <w:bookmarkStart w:id="867ec7a6-f297-42d9-884b-a57768ddc981" w:name="dv_vs_pred_ipred"/>
       <w:r>
         <w:rPr/>
         <w:t xml:space="preserve"/>
@@ -2620,7 +2620,7 @@
         <w:rPr/>
         <w:t xml:space="preserve"/>
       </w:r>
-      <w:bookmarkEnd w:id="a7a2d02c-53ed-4d7e-9acd-0bff3ac1b12e"/>
+      <w:bookmarkEnd w:id="867ec7a6-f297-42d9-884b-a57768ddc981"/>
       <w:r>
         <w:rPr>
           <w:rFonts/>
@@ -2708,7 +2708,7 @@
         </w:rPr>
         <w:t xml:space="preserve">Figure </w:t>
       </w:r>
-      <w:bookmarkStart w:id="b983d88c-48c0-4587-8a10-d8cc0a36987e" w:name="prm_vs_iteration"/>
+      <w:bookmarkStart w:id="07a14b17-eadd-43bb-8862-02809a2237bf" w:name="prm_vs_iteration"/>
       <w:r>
         <w:rPr/>
         <w:t xml:space="preserve"/>
@@ -2729,7 +2729,7 @@
         <w:rPr/>
         <w:t xml:space="preserve"/>
       </w:r>
-      <w:bookmarkEnd w:id="b983d88c-48c0-4587-8a10-d8cc0a36987e"/>
+      <w:bookmarkEnd w:id="07a14b17-eadd-43bb-8862-02809a2237bf"/>
       <w:r>
         <w:rPr>
           <w:rFonts/>

</xml_diff>

<commit_message>
Deploying to gh-pages from @ nlmixr2/monolix2rx@ca98fe7f4c5b83bc7afc2c44b4bb5c4289593dcc 🚀
</commit_message>
<xml_diff>
--- a/articles/mod-Word.docx
+++ b/articles/mod-Word.docx
@@ -2379,7 +2379,7 @@
         </w:rPr>
         <w:t xml:space="preserve">Table </w:t>
       </w:r>
-      <w:bookmarkStart w:id="d12f04ff-430e-44d7-86ec-6c4bfcbd1a0d" w:name="pest_table"/>
+      <w:bookmarkStart w:id="4991845e-fcd2-4263-9b8f-7585c7c91aa5" w:name="pest_table"/>
       <w:r>
         <w:rPr/>
         <w:t xml:space="preserve"/>
@@ -2400,7 +2400,7 @@
         <w:rPr/>
         <w:t xml:space="preserve"/>
       </w:r>
-      <w:bookmarkEnd w:id="d12f04ff-430e-44d7-86ec-6c4bfcbd1a0d"/>
+      <w:bookmarkEnd w:id="4991845e-fcd2-4263-9b8f-7585c7c91aa5"/>
       <w:r>
         <w:rPr>
           <w:rFonts/>
@@ -2496,7 +2496,7 @@
         </w:rPr>
         <w:t xml:space="preserve">Figure </w:t>
       </w:r>
-      <w:bookmarkStart w:id="918a34c2-aa4a-4048-a037-a13b1fc554b2" w:name="ind_plots"/>
+      <w:bookmarkStart w:id="2dc3069e-72a4-4e13-96eb-25671f480986" w:name="ind_plots"/>
       <w:r>
         <w:rPr/>
         <w:t xml:space="preserve"/>
@@ -2517,7 +2517,7 @@
         <w:rPr/>
         <w:t xml:space="preserve"/>
       </w:r>
-      <w:bookmarkEnd w:id="918a34c2-aa4a-4048-a037-a13b1fc554b2"/>
+      <w:bookmarkEnd w:id="2dc3069e-72a4-4e13-96eb-25671f480986"/>
       <w:r>
         <w:rPr>
           <w:rFonts/>
@@ -2599,7 +2599,7 @@
         </w:rPr>
         <w:t xml:space="preserve">Figure </w:t>
       </w:r>
-      <w:bookmarkStart w:id="867ec7a6-f297-42d9-884b-a57768ddc981" w:name="dv_vs_pred_ipred"/>
+      <w:bookmarkStart w:id="910ba8f3-8e9e-4442-886e-cf450a3c786d" w:name="dv_vs_pred_ipred"/>
       <w:r>
         <w:rPr/>
         <w:t xml:space="preserve"/>
@@ -2620,7 +2620,7 @@
         <w:rPr/>
         <w:t xml:space="preserve"/>
       </w:r>
-      <w:bookmarkEnd w:id="867ec7a6-f297-42d9-884b-a57768ddc981"/>
+      <w:bookmarkEnd w:id="910ba8f3-8e9e-4442-886e-cf450a3c786d"/>
       <w:r>
         <w:rPr>
           <w:rFonts/>
@@ -2708,7 +2708,7 @@
         </w:rPr>
         <w:t xml:space="preserve">Figure </w:t>
       </w:r>
-      <w:bookmarkStart w:id="07a14b17-eadd-43bb-8862-02809a2237bf" w:name="prm_vs_iteration"/>
+      <w:bookmarkStart w:id="ee89ea1f-9fe4-4861-bb32-d4ad6df7ad0a" w:name="prm_vs_iteration"/>
       <w:r>
         <w:rPr/>
         <w:t xml:space="preserve"/>
@@ -2729,7 +2729,7 @@
         <w:rPr/>
         <w:t xml:space="preserve"/>
       </w:r>
-      <w:bookmarkEnd w:id="07a14b17-eadd-43bb-8862-02809a2237bf"/>
+      <w:bookmarkEnd w:id="ee89ea1f-9fe4-4861-bb32-d4ad6df7ad0a"/>
       <w:r>
         <w:rPr>
           <w:rFonts/>

</xml_diff>

<commit_message>
Deploying to gh-pages from @ nlmixr2/monolix2rx@15a7d5536560a574b7f351370294bc018240e310 🚀
</commit_message>
<xml_diff>
--- a/articles/mod-Word.docx
+++ b/articles/mod-Word.docx
@@ -2379,7 +2379,7 @@
         </w:rPr>
         <w:t xml:space="preserve">Table </w:t>
       </w:r>
-      <w:bookmarkStart w:id="4991845e-fcd2-4263-9b8f-7585c7c91aa5" w:name="pest_table"/>
+      <w:bookmarkStart w:id="51052f60-0e62-441c-b391-0c7ad367095e" w:name="pest_table"/>
       <w:r>
         <w:rPr/>
         <w:t xml:space="preserve"/>
@@ -2400,7 +2400,7 @@
         <w:rPr/>
         <w:t xml:space="preserve"/>
       </w:r>
-      <w:bookmarkEnd w:id="4991845e-fcd2-4263-9b8f-7585c7c91aa5"/>
+      <w:bookmarkEnd w:id="51052f60-0e62-441c-b391-0c7ad367095e"/>
       <w:r>
         <w:rPr>
           <w:rFonts/>
@@ -2496,7 +2496,7 @@
         </w:rPr>
         <w:t xml:space="preserve">Figure </w:t>
       </w:r>
-      <w:bookmarkStart w:id="2dc3069e-72a4-4e13-96eb-25671f480986" w:name="ind_plots"/>
+      <w:bookmarkStart w:id="9f3589b0-4c09-401a-8445-aefbf9919876" w:name="ind_plots"/>
       <w:r>
         <w:rPr/>
         <w:t xml:space="preserve"/>
@@ -2517,7 +2517,7 @@
         <w:rPr/>
         <w:t xml:space="preserve"/>
       </w:r>
-      <w:bookmarkEnd w:id="2dc3069e-72a4-4e13-96eb-25671f480986"/>
+      <w:bookmarkEnd w:id="9f3589b0-4c09-401a-8445-aefbf9919876"/>
       <w:r>
         <w:rPr>
           <w:rFonts/>
@@ -2599,7 +2599,7 @@
         </w:rPr>
         <w:t xml:space="preserve">Figure </w:t>
       </w:r>
-      <w:bookmarkStart w:id="910ba8f3-8e9e-4442-886e-cf450a3c786d" w:name="dv_vs_pred_ipred"/>
+      <w:bookmarkStart w:id="bbe8cfac-aa87-4daf-ad6d-1d2d9911ad98" w:name="dv_vs_pred_ipred"/>
       <w:r>
         <w:rPr/>
         <w:t xml:space="preserve"/>
@@ -2620,7 +2620,7 @@
         <w:rPr/>
         <w:t xml:space="preserve"/>
       </w:r>
-      <w:bookmarkEnd w:id="910ba8f3-8e9e-4442-886e-cf450a3c786d"/>
+      <w:bookmarkEnd w:id="bbe8cfac-aa87-4daf-ad6d-1d2d9911ad98"/>
       <w:r>
         <w:rPr>
           <w:rFonts/>
@@ -2708,7 +2708,7 @@
         </w:rPr>
         <w:t xml:space="preserve">Figure </w:t>
       </w:r>
-      <w:bookmarkStart w:id="ee89ea1f-9fe4-4861-bb32-d4ad6df7ad0a" w:name="prm_vs_iteration"/>
+      <w:bookmarkStart w:id="1693e7f5-8a3e-422e-808b-55c40dd0ac84" w:name="prm_vs_iteration"/>
       <w:r>
         <w:rPr/>
         <w:t xml:space="preserve"/>
@@ -2729,7 +2729,7 @@
         <w:rPr/>
         <w:t xml:space="preserve"/>
       </w:r>
-      <w:bookmarkEnd w:id="ee89ea1f-9fe4-4861-bb32-d4ad6df7ad0a"/>
+      <w:bookmarkEnd w:id="1693e7f5-8a3e-422e-808b-55c40dd0ac84"/>
       <w:r>
         <w:rPr>
           <w:rFonts/>

</xml_diff>

<commit_message>
Deploying to gh-pages from @ nlmixr2/monolix2rx@4cd9f9c12714782320e60310b0b38407347c17c8 🚀
</commit_message>
<xml_diff>
--- a/articles/mod-Word.docx
+++ b/articles/mod-Word.docx
@@ -3,6 +3,958 @@
 <w:document xmlns:wpc="http://schemas.microsoft.com/office/word/2010/wordprocessingCanvas" xmlns:cx="http://schemas.microsoft.com/office/drawing/2014/chartex" xmlns:cx1="http://schemas.microsoft.com/office/drawing/2015/9/8/chartex" xmlns:cx2="http://schemas.microsoft.com/office/drawing/2015/10/21/chartex" xmlns:cx3="http://schemas.microsoft.com/office/drawing/2016/5/9/chartex" xmlns:cx4="http://schemas.microsoft.com/office/drawing/2016/5/10/chartex" xmlns:cx5="http://schemas.microsoft.com/office/drawing/2016/5/11/chartex" xmlns:cx6="http://schemas.microsoft.com/office/drawing/2016/5/12/chartex" xmlns:cx7="http://schemas.microsoft.com/office/drawing/2016/5/13/chartex" xmlns:cx8="http://schemas.microsoft.com/office/drawing/2016/5/14/chartex" xmlns:mc="http://schemas.openxmlformats.org/markup-compatibility/2006" xmlns:aink="http://schemas.microsoft.com/office/drawing/2016/ink" xmlns:am3d="http://schemas.microsoft.com/office/drawing/2017/model3d" xmlns:o="urn:schemas-microsoft-com:office:office" xmlns:r="http://schemas.openxmlformats.org/officeDocument/2006/relationships" xmlns:m="http://schemas.openxmlformats.org/officeDocument/2006/math" xmlns:v="urn:schemas-microsoft-com:vml" xmlns:wp14="http://schemas.microsoft.com/office/word/2010/wordprocessingDrawing" xmlns:wp="http://schemas.openxmlformats.org/drawingml/2006/wordprocessingDrawing" xmlns:w10="urn:schemas-microsoft-com:office:word" xmlns:w="http://schemas.openxmlformats.org/wordprocessingml/2006/main" xmlns:w14="http://schemas.microsoft.com/office/word/2010/wordml" xmlns:w15="http://schemas.microsoft.com/office/word/2012/wordml" xmlns:w16cex="http://schemas.microsoft.com/office/word/2018/wordml/cex" xmlns:w16cid="http://schemas.microsoft.com/office/word/2016/wordml/cid" xmlns:w16="http://schemas.microsoft.com/office/word/2018/wordml" xmlns:w16sdtdh="http://schemas.microsoft.com/office/word/2020/wordml/sdtdatahash" xmlns:w16se="http://schemas.microsoft.com/office/word/2015/wordml/symex" xmlns:wpg="http://schemas.microsoft.com/office/word/2010/wordprocessingGroup" xmlns:wpi="http://schemas.microsoft.com/office/word/2010/wordprocessingInk" xmlns:wne="http://schemas.microsoft.com/office/word/2006/wordml" xmlns:wps="http://schemas.microsoft.com/office/word/2010/wordprocessingShape" mc:Ignorable="w14 w15 w16se w16cid w16 w16cex w16sdtdh wp14">
   <w:body>
     <w:p/>
+    <w:p>
+      <w:pPr>
+        <w:pStyle w:val="Heading1"/>
+      </w:pPr>
+      <w:r>
+        <w:t xml:space="preserve">Model Structure</w:t>
+      </w:r>
+    </w:p>
+    <w:p>
+      <w:pPr>
+        <w:pStyle w:val="Normal"/>
+      </w:pPr>
+      <w:r>
+        <w:rPr/>
+        <w:drawing>
+          <wp:inline distT="0" distB="0" distL="0" distR="0">
+            <wp:extent cx="5943600" cy="5486400"/>
+            <wp:docPr id="1" name="" descr=""/>
+            <wp:cNvGraphicFramePr>
+              <a:graphicFrameLocks xmlns:a="http://schemas.openxmlformats.org/drawingml/2006/main" noChangeAspect="1"/>
+            </wp:cNvGraphicFramePr>
+            <a:graphic xmlns:a="http://schemas.openxmlformats.org/drawingml/2006/main">
+              <a:graphicData uri="http://schemas.openxmlformats.org/drawingml/2006/picture">
+                <pic:pic xmlns:pic="http://schemas.openxmlformats.org/drawingml/2006/picture">
+                  <pic:nvPicPr>
+                    <pic:cNvPr id="2" name=""/>
+                    <pic:cNvPicPr>
+                      <a:picLocks noChangeAspect="1" noChangeArrowheads="1"/>
+                    </pic:cNvPicPr>
+                  </pic:nvPicPr>
+                  <pic:blipFill>
+                    <a:blip r:embed="rId16"/>
+                    <a:stretch>
+                      <a:fillRect/>
+                    </a:stretch>
+                  </pic:blipFill>
+                  <pic:spPr bwMode="auto">
+                    <a:xfrm>
+                      <a:off x="0" y="0"/>
+                      <a:ext cx="5943600" cy="5486400"/>
+                    </a:xfrm>
+                    <a:prstGeom prst="rect">
+                      <a:avLst/>
+                    </a:prstGeom>
+                    <a:noFill/>
+                  </pic:spPr>
+                </pic:pic>
+              </a:graphicData>
+            </a:graphic>
+          </wp:inline>
+        </w:drawing>
+      </w:r>
+    </w:p>
+    <w:p>
+      <w:pPr>
+        <w:pStyle w:val="graphictitle"/>
+      </w:pPr>
+      <w:r>
+        <w:rPr>
+          <w:rFonts/>
+          <w:strike w:val="false"/>
+        </w:rPr>
+        <w:t xml:space="preserve">Figure </w:t>
+      </w:r>
+      <w:bookmarkStart w:id="1a47d327-473c-48cc-903d-083292be502c" w:name="model_diagram"/>
+      <w:r>
+        <w:rPr/>
+        <w:t xml:space="preserve"/>
+      </w:r>
+      <w:r>
+        <w:rPr/>
+        <w:fldChar w:fldCharType="begin" w:dirty="true"/>
+      </w:r>
+      <w:r>
+        <w:rPr/>
+        <w:instrText xml:space="preserve" w:dirty="true">SEQ Figure \* Arabic</w:instrText>
+      </w:r>
+      <w:r>
+        <w:rPr/>
+        <w:fldChar w:fldCharType="end" w:dirty="true"/>
+      </w:r>
+      <w:r>
+        <w:rPr/>
+        <w:t xml:space="preserve"/>
+      </w:r>
+      <w:bookmarkEnd w:id="1a47d327-473c-48cc-903d-083292be502c"/>
+      <w:r>
+        <w:rPr>
+          <w:rFonts/>
+          <w:strike w:val="false"/>
+        </w:rPr>
+        <w:t xml:space="preserve">. </w:t>
+      </w:r>
+      <w:r>
+        <w:rPr>
+          <w:rFonts/>
+          <w:strike w:val="false"/>
+        </w:rPr>
+        <w:t xml:space="preserve">Model structure</w:t>
+      </w:r>
+    </w:p>
+    <w:p>
+      <w:pPr/>
+      <w:r>
+        <w:br w:type="page"/>
+      </w:r>
+    </w:p>
+    <w:tbl xmlns:a="http://schemas.openxmlformats.org/drawingml/2006/main" xmlns:pic="http://schemas.openxmlformats.org/drawingml/2006/picture">
+      <w:tblPr>
+        <w:tblLayout w:type="fixed"/>
+        <w:jc w:val="center"/>
+        <w:tblLook w:firstRow="1" w:lastRow="0" w:firstColumn="0" w:lastColumn="0" w:noHBand="0" w:noVBand="1"/>
+      </w:tblPr>
+      <w:tblGrid>
+        <w:gridCol w:w="8640"/>
+      </w:tblGrid>
+      <w:tr>
+        <w:trPr>
+          <w:trHeight w:val="360" w:hRule="auto"/>
+        </w:trPr>
+        <w:tc>
+          <w:tcPr>
+            <w:tcBorders>
+              <w:bottom w:val="none" w:sz="0" w:space="0" w:color="000000"/>
+              <w:top w:val="none" w:sz="0" w:space="0" w:color="000000"/>
+              <w:left w:val="none" w:sz="0" w:space="0" w:color="000000"/>
+              <w:right w:val="none" w:sz="0" w:space="0" w:color="000000"/>
+            </w:tcBorders>
+            <w:shd w:val="clear" w:color="auto" w:fill="FFFFFF"/>
+            <w:tcMar>
+              <w:top w:w="0" w:type="dxa"/>
+              <w:bottom w:w="0" w:type="dxa"/>
+              <w:left w:w="0" w:type="dxa"/>
+              <w:right w:w="0" w:type="dxa"/>
+            </w:tcMar>
+            <w:vAlign w:val="center"/>
+          </w:tcPr>
+          <w:p>
+            <w:pPr>
+              <w:pStyle w:val="Normal"/>
+              <w:jc w:val="left"/>
+              <w:pBdr>
+                <w:bottom w:val="none" w:sz="0" w:space="0" w:color="000000"/>
+                <w:top w:val="none" w:sz="0" w:space="0" w:color="000000"/>
+                <w:left w:val="none" w:sz="0" w:space="0" w:color="000000"/>
+                <w:right w:val="none" w:sz="0" w:space="0" w:color="000000"/>
+              </w:pBdr>
+              <w:spacing w:after="100" w:before="100" w:line="480"/>
+              <w:ind w:left="100" w:right="100" w:firstLine="0" w:firstLineChars="0"/>
+              <w:rPr>
+                <w:rFonts w:ascii="DejaVu Sans" w:hAnsi="DejaVu Sans" w:eastAsia="DejaVu Sans" w:cs="DejaVu Sans"/>
+                <w:i w:val="false"/>
+                <w:b w:val="false"/>
+                <w:u w:val="none"/>
+                <w:strike w:val="false"/>
+                <w:sz w:val="22"/>
+                <w:szCs w:val="22"/>
+                <w:color w:val="000000"/>
+              </w:rPr>
+            </w:pPr>
+            <m:oMath xmlns:mml="http://www.w3.org/1998/Math/MathML">
+              <m:r>
+                <m:t>cmt(</m:t>
+              </m:r>
+              <m:r>
+                <m:t>depot</m:t>
+              </m:r>
+              <m:r>
+                <m:t>)</m:t>
+              </m:r>
+            </m:oMath>
+          </w:p>
+        </w:tc>
+      </w:tr>
+      <w:tr>
+        <w:trPr>
+          <w:trHeight w:val="360" w:hRule="auto"/>
+        </w:trPr>
+        <w:tc>
+          <w:tcPr>
+            <w:tcBorders>
+              <w:bottom w:val="none" w:sz="0" w:space="0" w:color="000000"/>
+              <w:top w:val="none" w:sz="0" w:space="0" w:color="000000"/>
+              <w:left w:val="none" w:sz="0" w:space="0" w:color="000000"/>
+              <w:right w:val="none" w:sz="0" w:space="0" w:color="000000"/>
+            </w:tcBorders>
+            <w:shd w:val="clear" w:color="auto" w:fill="FFFFFF"/>
+            <w:tcMar>
+              <w:top w:w="0" w:type="dxa"/>
+              <w:bottom w:w="0" w:type="dxa"/>
+              <w:left w:w="0" w:type="dxa"/>
+              <w:right w:w="0" w:type="dxa"/>
+            </w:tcMar>
+            <w:vAlign w:val="center"/>
+          </w:tcPr>
+          <w:p>
+            <w:pPr>
+              <w:pStyle w:val="Normal"/>
+              <w:jc w:val="left"/>
+              <w:pBdr>
+                <w:bottom w:val="none" w:sz="0" w:space="0" w:color="000000"/>
+                <w:top w:val="none" w:sz="0" w:space="0" w:color="000000"/>
+                <w:left w:val="none" w:sz="0" w:space="0" w:color="000000"/>
+                <w:right w:val="none" w:sz="0" w:space="0" w:color="000000"/>
+              </w:pBdr>
+              <w:spacing w:after="100" w:before="100" w:line="480"/>
+              <w:ind w:left="100" w:right="100" w:firstLine="0" w:firstLineChars="0"/>
+              <w:rPr>
+                <w:rFonts w:ascii="DejaVu Sans" w:hAnsi="DejaVu Sans" w:eastAsia="DejaVu Sans" w:cs="DejaVu Sans"/>
+                <w:i w:val="false"/>
+                <w:b w:val="false"/>
+                <w:u w:val="none"/>
+                <w:strike w:val="false"/>
+                <w:sz w:val="22"/>
+                <w:szCs w:val="22"/>
+                <w:color w:val="000000"/>
+              </w:rPr>
+            </w:pPr>
+            <m:oMath xmlns:mml="http://www.w3.org/1998/Math/MathML">
+              <m:r>
+                <m:t>cmt(</m:t>
+              </m:r>
+              <m:r>
+                <m:t>central</m:t>
+              </m:r>
+              <m:r>
+                <m:t>)</m:t>
+              </m:r>
+            </m:oMath>
+          </w:p>
+        </w:tc>
+      </w:tr>
+      <w:tr>
+        <w:trPr>
+          <w:trHeight w:val="360" w:hRule="auto"/>
+        </w:trPr>
+        <w:tc>
+          <w:tcPr>
+            <w:tcBorders>
+              <w:bottom w:val="none" w:sz="0" w:space="0" w:color="000000"/>
+              <w:top w:val="none" w:sz="0" w:space="0" w:color="000000"/>
+              <w:left w:val="none" w:sz="0" w:space="0" w:color="000000"/>
+              <w:right w:val="none" w:sz="0" w:space="0" w:color="000000"/>
+            </w:tcBorders>
+            <w:shd w:val="clear" w:color="auto" w:fill="FFFFFF"/>
+            <w:tcMar>
+              <w:top w:w="0" w:type="dxa"/>
+              <w:bottom w:w="0" w:type="dxa"/>
+              <w:left w:w="0" w:type="dxa"/>
+              <w:right w:w="0" w:type="dxa"/>
+            </w:tcMar>
+            <w:vAlign w:val="center"/>
+          </w:tcPr>
+          <w:p>
+            <w:pPr>
+              <w:pStyle w:val="Normal"/>
+              <w:jc w:val="left"/>
+              <w:pBdr>
+                <w:bottom w:val="none" w:sz="0" w:space="0" w:color="000000"/>
+                <w:top w:val="none" w:sz="0" w:space="0" w:color="000000"/>
+                <w:left w:val="none" w:sz="0" w:space="0" w:color="000000"/>
+                <w:right w:val="none" w:sz="0" w:space="0" w:color="000000"/>
+              </w:pBdr>
+              <w:spacing w:after="100" w:before="100" w:line="480"/>
+              <w:ind w:left="100" w:right="100" w:firstLine="0" w:firstLineChars="0"/>
+              <w:rPr>
+                <w:rFonts w:ascii="DejaVu Sans" w:hAnsi="DejaVu Sans" w:eastAsia="DejaVu Sans" w:cs="DejaVu Sans"/>
+                <w:i w:val="false"/>
+                <w:b w:val="false"/>
+                <w:u w:val="none"/>
+                <w:strike w:val="false"/>
+                <w:sz w:val="22"/>
+                <w:szCs w:val="22"/>
+                <w:color w:val="000000"/>
+              </w:rPr>
+            </w:pPr>
+            <m:oMath xmlns:mml="http://www.w3.org/1998/Math/MathML">
+              <m:r>
+                <m:t>ka</m:t>
+              </m:r>
+              <m:r>
+                <m:t>=</m:t>
+              </m:r>
+              <m:r>
+                <m:rPr>
+                  <m:sty m:val="p"/>
+                </m:rPr>
+                <m:t>exp</m:t>
+              </m:r>
+              <m:r>
+                <m:t>⁡</m:t>
+              </m:r>
+              <m:r>
+                <m:t>(</m:t>
+              </m:r>
+              <m:r>
+                <m:t>ka</m:t>
+              </m:r>
+              <m:r>
+                <m:rPr>
+                  <m:sty m:val="p"/>
+                </m:rPr>
+                <m:t>_</m:t>
+              </m:r>
+              <m:r>
+                <m:t>pop</m:t>
+              </m:r>
+              <m:r>
+                <m:t>+</m:t>
+              </m:r>
+              <m:r>
+                <m:t>omega</m:t>
+              </m:r>
+              <m:r>
+                <m:rPr>
+                  <m:sty m:val="p"/>
+                </m:rPr>
+                <m:t>_</m:t>
+              </m:r>
+              <m:r>
+                <m:t>ka</m:t>
+              </m:r>
+              <m:r>
+                <m:t>)</m:t>
+              </m:r>
+            </m:oMath>
+          </w:p>
+        </w:tc>
+      </w:tr>
+      <w:tr>
+        <w:trPr>
+          <w:trHeight w:val="360" w:hRule="auto"/>
+        </w:trPr>
+        <w:tc>
+          <w:tcPr>
+            <w:tcBorders>
+              <w:bottom w:val="none" w:sz="0" w:space="0" w:color="000000"/>
+              <w:top w:val="none" w:sz="0" w:space="0" w:color="000000"/>
+              <w:left w:val="none" w:sz="0" w:space="0" w:color="000000"/>
+              <w:right w:val="none" w:sz="0" w:space="0" w:color="000000"/>
+            </w:tcBorders>
+            <w:shd w:val="clear" w:color="auto" w:fill="FFFFFF"/>
+            <w:tcMar>
+              <w:top w:w="0" w:type="dxa"/>
+              <w:bottom w:w="0" w:type="dxa"/>
+              <w:left w:w="0" w:type="dxa"/>
+              <w:right w:w="0" w:type="dxa"/>
+            </w:tcMar>
+            <w:vAlign w:val="center"/>
+          </w:tcPr>
+          <w:p>
+            <w:pPr>
+              <w:pStyle w:val="Normal"/>
+              <w:jc w:val="left"/>
+              <w:pBdr>
+                <w:bottom w:val="none" w:sz="0" w:space="0" w:color="000000"/>
+                <w:top w:val="none" w:sz="0" w:space="0" w:color="000000"/>
+                <w:left w:val="none" w:sz="0" w:space="0" w:color="000000"/>
+                <w:right w:val="none" w:sz="0" w:space="0" w:color="000000"/>
+              </w:pBdr>
+              <w:spacing w:after="100" w:before="100" w:line="480"/>
+              <w:ind w:left="100" w:right="100" w:firstLine="0" w:firstLineChars="0"/>
+              <w:rPr>
+                <w:rFonts w:ascii="DejaVu Sans" w:hAnsi="DejaVu Sans" w:eastAsia="DejaVu Sans" w:cs="DejaVu Sans"/>
+                <w:i w:val="false"/>
+                <w:b w:val="false"/>
+                <w:u w:val="none"/>
+                <w:strike w:val="false"/>
+                <w:sz w:val="22"/>
+                <w:szCs w:val="22"/>
+                <w:color w:val="000000"/>
+              </w:rPr>
+            </w:pPr>
+            <m:oMath xmlns:mml="http://www.w3.org/1998/Math/MathML">
+              <m:r>
+                <m:t>V=</m:t>
+              </m:r>
+              <m:r>
+                <m:rPr>
+                  <m:sty m:val="p"/>
+                </m:rPr>
+                <m:t>exp</m:t>
+              </m:r>
+              <m:r>
+                <m:t>⁡</m:t>
+              </m:r>
+              <m:r>
+                <m:t>(</m:t>
+              </m:r>
+              <m:r>
+                <m:t>V</m:t>
+              </m:r>
+              <m:r>
+                <m:rPr>
+                  <m:sty m:val="p"/>
+                </m:rPr>
+                <m:t>_</m:t>
+              </m:r>
+              <m:r>
+                <m:t>pop</m:t>
+              </m:r>
+              <m:r>
+                <m:t>+</m:t>
+              </m:r>
+              <m:r>
+                <m:t>omega</m:t>
+              </m:r>
+              <m:r>
+                <m:rPr>
+                  <m:sty m:val="p"/>
+                </m:rPr>
+                <m:t>_</m:t>
+              </m:r>
+              <m:r>
+                <m:t>V</m:t>
+              </m:r>
+              <m:r>
+                <m:t>)</m:t>
+              </m:r>
+            </m:oMath>
+          </w:p>
+        </w:tc>
+      </w:tr>
+      <w:tr>
+        <w:trPr>
+          <w:trHeight w:val="360" w:hRule="auto"/>
+        </w:trPr>
+        <w:tc>
+          <w:tcPr>
+            <w:tcBorders>
+              <w:bottom w:val="none" w:sz="0" w:space="0" w:color="000000"/>
+              <w:top w:val="none" w:sz="0" w:space="0" w:color="000000"/>
+              <w:left w:val="none" w:sz="0" w:space="0" w:color="000000"/>
+              <w:right w:val="none" w:sz="0" w:space="0" w:color="000000"/>
+            </w:tcBorders>
+            <w:shd w:val="clear" w:color="auto" w:fill="FFFFFF"/>
+            <w:tcMar>
+              <w:top w:w="0" w:type="dxa"/>
+              <w:bottom w:w="0" w:type="dxa"/>
+              <w:left w:w="0" w:type="dxa"/>
+              <w:right w:w="0" w:type="dxa"/>
+            </w:tcMar>
+            <w:vAlign w:val="center"/>
+          </w:tcPr>
+          <w:p>
+            <w:pPr>
+              <w:pStyle w:val="Normal"/>
+              <w:jc w:val="left"/>
+              <w:pBdr>
+                <w:bottom w:val="none" w:sz="0" w:space="0" w:color="000000"/>
+                <w:top w:val="none" w:sz="0" w:space="0" w:color="000000"/>
+                <w:left w:val="none" w:sz="0" w:space="0" w:color="000000"/>
+                <w:right w:val="none" w:sz="0" w:space="0" w:color="000000"/>
+              </w:pBdr>
+              <w:spacing w:after="100" w:before="100" w:line="480"/>
+              <w:ind w:left="100" w:right="100" w:firstLine="0" w:firstLineChars="0"/>
+              <w:rPr>
+                <w:rFonts w:ascii="DejaVu Sans" w:hAnsi="DejaVu Sans" w:eastAsia="DejaVu Sans" w:cs="DejaVu Sans"/>
+                <w:i w:val="false"/>
+                <w:b w:val="false"/>
+                <w:u w:val="none"/>
+                <w:strike w:val="false"/>
+                <w:sz w:val="22"/>
+                <w:szCs w:val="22"/>
+                <w:color w:val="000000"/>
+              </w:rPr>
+            </w:pPr>
+            <m:oMath xmlns:mml="http://www.w3.org/1998/Math/MathML">
+              <m:r>
+                <m:t>Cl</m:t>
+              </m:r>
+              <m:r>
+                <m:t>=</m:t>
+              </m:r>
+              <m:r>
+                <m:rPr>
+                  <m:sty m:val="p"/>
+                </m:rPr>
+                <m:t>exp</m:t>
+              </m:r>
+              <m:r>
+                <m:t>⁡</m:t>
+              </m:r>
+              <m:r>
+                <m:t>(</m:t>
+              </m:r>
+              <m:r>
+                <m:t>Cl</m:t>
+              </m:r>
+              <m:r>
+                <m:rPr>
+                  <m:sty m:val="p"/>
+                </m:rPr>
+                <m:t>_</m:t>
+              </m:r>
+              <m:r>
+                <m:t>pop</m:t>
+              </m:r>
+              <m:r>
+                <m:t>+</m:t>
+              </m:r>
+              <m:r>
+                <m:t>omega</m:t>
+              </m:r>
+              <m:r>
+                <m:rPr>
+                  <m:sty m:val="p"/>
+                </m:rPr>
+                <m:t>_</m:t>
+              </m:r>
+              <m:r>
+                <m:t>Cl</m:t>
+              </m:r>
+              <m:r>
+                <m:t>)</m:t>
+              </m:r>
+            </m:oMath>
+          </w:p>
+        </w:tc>
+      </w:tr>
+      <w:tr>
+        <w:trPr>
+          <w:trHeight w:val="360" w:hRule="auto"/>
+        </w:trPr>
+        <w:tc>
+          <w:tcPr>
+            <w:tcBorders>
+              <w:bottom w:val="none" w:sz="0" w:space="0" w:color="000000"/>
+              <w:top w:val="none" w:sz="0" w:space="0" w:color="000000"/>
+              <w:left w:val="none" w:sz="0" w:space="0" w:color="000000"/>
+              <w:right w:val="none" w:sz="0" w:space="0" w:color="000000"/>
+            </w:tcBorders>
+            <w:shd w:val="clear" w:color="auto" w:fill="FFFFFF"/>
+            <w:tcMar>
+              <w:top w:w="0" w:type="dxa"/>
+              <w:bottom w:w="0" w:type="dxa"/>
+              <w:left w:w="0" w:type="dxa"/>
+              <w:right w:w="0" w:type="dxa"/>
+            </w:tcMar>
+            <w:vAlign w:val="center"/>
+          </w:tcPr>
+          <w:p>
+            <w:pPr>
+              <w:pStyle w:val="Normal"/>
+              <w:jc w:val="left"/>
+              <w:pBdr>
+                <w:bottom w:val="none" w:sz="0" w:space="0" w:color="000000"/>
+                <w:top w:val="none" w:sz="0" w:space="0" w:color="000000"/>
+                <w:left w:val="none" w:sz="0" w:space="0" w:color="000000"/>
+                <w:right w:val="none" w:sz="0" w:space="0" w:color="000000"/>
+              </w:pBdr>
+              <w:spacing w:after="100" w:before="100" w:line="480"/>
+              <w:ind w:left="100" w:right="100" w:firstLine="0" w:firstLineChars="0"/>
+              <w:rPr>
+                <w:rFonts w:ascii="DejaVu Sans" w:hAnsi="DejaVu Sans" w:eastAsia="DejaVu Sans" w:cs="DejaVu Sans"/>
+                <w:i w:val="false"/>
+                <w:b w:val="false"/>
+                <w:u w:val="none"/>
+                <w:strike w:val="false"/>
+                <w:sz w:val="22"/>
+                <w:szCs w:val="22"/>
+                <w:color w:val="000000"/>
+              </w:rPr>
+            </w:pPr>
+            <m:oMath xmlns:mml="http://www.w3.org/1998/Math/MathML">
+              <m:f>
+                <m:fPr>
+                  <m:type m:val="bar"/>
+                </m:fPr>
+                <m:num>
+                  <m:r>
+                    <m:t>d</m:t>
+                  </m:r>
+                  <m:r>
+                    <m:rPr>
+                      <m:nor/>
+                    </m:rPr>
+                    <m:t> </m:t>
+                  </m:r>
+                  <m:r>
+                    <m:t>depot</m:t>
+                  </m:r>
+                </m:num>
+                <m:den>
+                  <m:r>
+                    <m:t>dt</m:t>
+                  </m:r>
+                </m:den>
+              </m:f>
+              <m:r>
+                <m:t>=−</m:t>
+              </m:r>
+              <m:r>
+                <m:t>ka</m:t>
+              </m:r>
+              <m:r>
+                <m:t>×</m:t>
+              </m:r>
+              <m:r>
+                <m:t>depot</m:t>
+              </m:r>
+            </m:oMath>
+          </w:p>
+        </w:tc>
+      </w:tr>
+      <w:tr>
+        <w:trPr>
+          <w:trHeight w:val="360" w:hRule="auto"/>
+        </w:trPr>
+        <w:tc>
+          <w:tcPr>
+            <w:tcBorders>
+              <w:bottom w:val="none" w:sz="0" w:space="0" w:color="000000"/>
+              <w:top w:val="none" w:sz="0" w:space="0" w:color="000000"/>
+              <w:left w:val="none" w:sz="0" w:space="0" w:color="000000"/>
+              <w:right w:val="none" w:sz="0" w:space="0" w:color="000000"/>
+            </w:tcBorders>
+            <w:shd w:val="clear" w:color="auto" w:fill="FFFFFF"/>
+            <w:tcMar>
+              <w:top w:w="0" w:type="dxa"/>
+              <w:bottom w:w="0" w:type="dxa"/>
+              <w:left w:w="0" w:type="dxa"/>
+              <w:right w:w="0" w:type="dxa"/>
+            </w:tcMar>
+            <w:vAlign w:val="center"/>
+          </w:tcPr>
+          <w:p>
+            <w:pPr>
+              <w:pStyle w:val="Normal"/>
+              <w:jc w:val="left"/>
+              <w:pBdr>
+                <w:bottom w:val="none" w:sz="0" w:space="0" w:color="000000"/>
+                <w:top w:val="none" w:sz="0" w:space="0" w:color="000000"/>
+                <w:left w:val="none" w:sz="0" w:space="0" w:color="000000"/>
+                <w:right w:val="none" w:sz="0" w:space="0" w:color="000000"/>
+              </w:pBdr>
+              <w:spacing w:after="100" w:before="100" w:line="480"/>
+              <w:ind w:left="100" w:right="100" w:firstLine="0" w:firstLineChars="0"/>
+              <w:rPr>
+                <w:rFonts w:ascii="DejaVu Sans" w:hAnsi="DejaVu Sans" w:eastAsia="DejaVu Sans" w:cs="DejaVu Sans"/>
+                <w:i w:val="false"/>
+                <w:b w:val="false"/>
+                <w:u w:val="none"/>
+                <w:strike w:val="false"/>
+                <w:sz w:val="22"/>
+                <w:szCs w:val="22"/>
+                <w:color w:val="000000"/>
+              </w:rPr>
+            </w:pPr>
+            <m:oMath xmlns:mml="http://www.w3.org/1998/Math/MathML">
+              <m:f>
+                <m:fPr>
+                  <m:type m:val="bar"/>
+                </m:fPr>
+                <m:num>
+                  <m:r>
+                    <m:t>d</m:t>
+                  </m:r>
+                  <m:r>
+                    <m:rPr>
+                      <m:nor/>
+                    </m:rPr>
+                    <m:t> </m:t>
+                  </m:r>
+                  <m:r>
+                    <m:t>central</m:t>
+                  </m:r>
+                </m:num>
+                <m:den>
+                  <m:r>
+                    <m:t>dt</m:t>
+                  </m:r>
+                </m:den>
+              </m:f>
+              <m:r>
+                <m:t>=+</m:t>
+              </m:r>
+              <m:r>
+                <m:t>ka</m:t>
+              </m:r>
+              <m:r>
+                <m:t>×</m:t>
+              </m:r>
+              <m:r>
+                <m:t>depot</m:t>
+              </m:r>
+              <m:r>
+                <m:t>−</m:t>
+              </m:r>
+              <m:f>
+                <m:fPr>
+                  <m:type m:val="bar"/>
+                </m:fPr>
+                <m:num>
+                  <m:r>
+                    <m:t>Cl</m:t>
+                  </m:r>
+                </m:num>
+                <m:den>
+                  <m:r>
+                    <m:t>V</m:t>
+                  </m:r>
+                </m:den>
+              </m:f>
+              <m:r>
+                <m:t>×</m:t>
+              </m:r>
+              <m:r>
+                <m:t>central</m:t>
+              </m:r>
+            </m:oMath>
+          </w:p>
+        </w:tc>
+      </w:tr>
+      <w:tr>
+        <w:trPr>
+          <w:trHeight w:val="360" w:hRule="auto"/>
+        </w:trPr>
+        <w:tc>
+          <w:tcPr>
+            <w:tcBorders>
+              <w:bottom w:val="none" w:sz="0" w:space="0" w:color="000000"/>
+              <w:top w:val="none" w:sz="0" w:space="0" w:color="000000"/>
+              <w:left w:val="none" w:sz="0" w:space="0" w:color="000000"/>
+              <w:right w:val="none" w:sz="0" w:space="0" w:color="000000"/>
+            </w:tcBorders>
+            <w:shd w:val="clear" w:color="auto" w:fill="FFFFFF"/>
+            <w:tcMar>
+              <w:top w:w="0" w:type="dxa"/>
+              <w:bottom w:w="0" w:type="dxa"/>
+              <w:left w:w="0" w:type="dxa"/>
+              <w:right w:w="0" w:type="dxa"/>
+            </w:tcMar>
+            <w:vAlign w:val="center"/>
+          </w:tcPr>
+          <w:p>
+            <w:pPr>
+              <w:pStyle w:val="Normal"/>
+              <w:jc w:val="left"/>
+              <w:pBdr>
+                <w:bottom w:val="none" w:sz="0" w:space="0" w:color="000000"/>
+                <w:top w:val="none" w:sz="0" w:space="0" w:color="000000"/>
+                <w:left w:val="none" w:sz="0" w:space="0" w:color="000000"/>
+                <w:right w:val="none" w:sz="0" w:space="0" w:color="000000"/>
+              </w:pBdr>
+              <w:spacing w:after="100" w:before="100" w:line="480"/>
+              <w:ind w:left="100" w:right="100" w:firstLine="0" w:firstLineChars="0"/>
+              <w:rPr>
+                <w:rFonts w:ascii="DejaVu Sans" w:hAnsi="DejaVu Sans" w:eastAsia="DejaVu Sans" w:cs="DejaVu Sans"/>
+                <w:i w:val="false"/>
+                <w:b w:val="false"/>
+                <w:u w:val="none"/>
+                <w:strike w:val="false"/>
+                <w:sz w:val="22"/>
+                <w:szCs w:val="22"/>
+                <w:color w:val="000000"/>
+              </w:rPr>
+            </w:pPr>
+            <m:oMath xmlns:mml="http://www.w3.org/1998/Math/MathML">
+              <m:r>
+                <m:t>Cc</m:t>
+              </m:r>
+              <m:r>
+                <m:t>=</m:t>
+              </m:r>
+              <m:f>
+                <m:fPr>
+                  <m:type m:val="bar"/>
+                </m:fPr>
+                <m:num>
+                  <m:r>
+                    <m:t>central</m:t>
+                  </m:r>
+                </m:num>
+                <m:den>
+                  <m:r>
+                    <m:t>V</m:t>
+                  </m:r>
+                </m:den>
+              </m:f>
+            </m:oMath>
+          </w:p>
+        </w:tc>
+      </w:tr>
+      <w:tr>
+        <w:trPr>
+          <w:trHeight w:val="360" w:hRule="auto"/>
+        </w:trPr>
+        <w:tc>
+          <w:tcPr>
+            <w:tcBorders>
+              <w:bottom w:val="none" w:sz="0" w:space="0" w:color="000000"/>
+              <w:top w:val="none" w:sz="0" w:space="0" w:color="000000"/>
+              <w:left w:val="none" w:sz="0" w:space="0" w:color="000000"/>
+              <w:right w:val="none" w:sz="0" w:space="0" w:color="000000"/>
+            </w:tcBorders>
+            <w:shd w:val="clear" w:color="auto" w:fill="FFFFFF"/>
+            <w:tcMar>
+              <w:top w:w="0" w:type="dxa"/>
+              <w:bottom w:w="0" w:type="dxa"/>
+              <w:left w:w="0" w:type="dxa"/>
+              <w:right w:w="0" w:type="dxa"/>
+            </w:tcMar>
+            <w:vAlign w:val="center"/>
+          </w:tcPr>
+          <w:p>
+            <w:pPr>
+              <w:pStyle w:val="Normal"/>
+              <w:jc w:val="left"/>
+              <w:pBdr>
+                <w:bottom w:val="none" w:sz="0" w:space="0" w:color="000000"/>
+                <w:top w:val="none" w:sz="0" w:space="0" w:color="000000"/>
+                <w:left w:val="none" w:sz="0" w:space="0" w:color="000000"/>
+                <w:right w:val="none" w:sz="0" w:space="0" w:color="000000"/>
+              </w:pBdr>
+              <w:spacing w:after="100" w:before="100" w:line="480"/>
+              <w:ind w:left="100" w:right="100" w:firstLine="0" w:firstLineChars="0"/>
+              <w:rPr>
+                <w:rFonts w:ascii="DejaVu Sans" w:hAnsi="DejaVu Sans" w:eastAsia="DejaVu Sans" w:cs="DejaVu Sans"/>
+                <w:i w:val="false"/>
+                <w:b w:val="false"/>
+                <w:u w:val="none"/>
+                <w:strike w:val="false"/>
+                <w:sz w:val="22"/>
+                <w:szCs w:val="22"/>
+                <w:color w:val="000000"/>
+              </w:rPr>
+            </w:pPr>
+            <m:oMath xmlns:mml="http://www.w3.org/1998/Math/MathML">
+              <m:r>
+                <m:t>CONC</m:t>
+              </m:r>
+              <m:r>
+                <m:t>=</m:t>
+              </m:r>
+              <m:r>
+                <m:t>Cc</m:t>
+              </m:r>
+            </m:oMath>
+          </w:p>
+        </w:tc>
+      </w:tr>
+      <w:tr>
+        <w:trPr>
+          <w:trHeight w:val="360" w:hRule="auto"/>
+        </w:trPr>
+        <w:tc>
+          <w:tcPr>
+            <w:tcBorders>
+              <w:bottom w:val="none" w:sz="0" w:space="0" w:color="000000"/>
+              <w:top w:val="none" w:sz="0" w:space="0" w:color="000000"/>
+              <w:left w:val="none" w:sz="0" w:space="0" w:color="000000"/>
+              <w:right w:val="none" w:sz="0" w:space="0" w:color="000000"/>
+            </w:tcBorders>
+            <w:shd w:val="clear" w:color="auto" w:fill="FFFFFF"/>
+            <w:tcMar>
+              <w:top w:w="0" w:type="dxa"/>
+              <w:bottom w:w="0" w:type="dxa"/>
+              <w:left w:w="0" w:type="dxa"/>
+              <w:right w:w="0" w:type="dxa"/>
+            </w:tcMar>
+            <w:vAlign w:val="center"/>
+          </w:tcPr>
+          <w:p>
+            <w:pPr>
+              <w:pStyle w:val="Normal"/>
+              <w:jc w:val="left"/>
+              <w:pBdr>
+                <w:bottom w:val="none" w:sz="0" w:space="0" w:color="000000"/>
+                <w:top w:val="none" w:sz="0" w:space="0" w:color="000000"/>
+                <w:left w:val="none" w:sz="0" w:space="0" w:color="000000"/>
+                <w:right w:val="none" w:sz="0" w:space="0" w:color="000000"/>
+              </w:pBdr>
+              <w:spacing w:after="100" w:before="100" w:line="480"/>
+              <w:ind w:left="100" w:right="100" w:firstLine="0" w:firstLineChars="0"/>
+              <w:rPr>
+                <w:rFonts w:ascii="DejaVu Sans" w:hAnsi="DejaVu Sans" w:eastAsia="DejaVu Sans" w:cs="DejaVu Sans"/>
+                <w:i w:val="false"/>
+                <w:b w:val="false"/>
+                <w:u w:val="none"/>
+                <w:strike w:val="false"/>
+                <w:sz w:val="22"/>
+                <w:szCs w:val="22"/>
+                <w:color w:val="000000"/>
+              </w:rPr>
+            </w:pPr>
+            <m:oMath xmlns:mml="http://www.w3.org/1998/Math/MathML">
+              <m:r>
+                <m:t>CONC</m:t>
+              </m:r>
+              <m:r>
+                <m:t>∼add(a)+prop(b)+combined1()</m:t>
+              </m:r>
+            </m:oMath>
+          </w:p>
+        </w:tc>
+      </w:tr>
+    </w:tbl>
+    <w:p>
+      <w:pPr>
+        <w:pStyle w:val="tabletitle"/>
+      </w:pPr>
+      <w:r>
+        <w:rPr>
+          <w:rFonts/>
+          <w:strike w:val="false"/>
+        </w:rPr>
+        <w:t xml:space="preserve">Table </w:t>
+      </w:r>
+      <w:bookmarkStart w:id="d6b19e51-964a-400e-b76e-6341d43bf3d1" w:name="model_equations"/>
+      <w:r>
+        <w:rPr/>
+        <w:t xml:space="preserve"/>
+      </w:r>
+      <w:r>
+        <w:rPr/>
+        <w:fldChar w:fldCharType="begin" w:dirty="true"/>
+      </w:r>
+      <w:r>
+        <w:rPr/>
+        <w:instrText xml:space="preserve" w:dirty="true">SEQ Table \* Arabic</w:instrText>
+      </w:r>
+      <w:r>
+        <w:rPr/>
+        <w:fldChar w:fldCharType="end" w:dirty="true"/>
+      </w:r>
+      <w:r>
+        <w:rPr/>
+        <w:t xml:space="preserve"/>
+      </w:r>
+      <w:bookmarkEnd w:id="d6b19e51-964a-400e-b76e-6341d43bf3d1"/>
+      <w:r>
+        <w:rPr>
+          <w:rFonts/>
+          <w:strike w:val="false"/>
+        </w:rPr>
+        <w:t xml:space="preserve">. </w:t>
+      </w:r>
+      <w:r>
+        <w:rPr>
+          <w:rFonts/>
+          <w:strike w:val="false"/>
+        </w:rPr>
+        <w:t xml:space="preserve">Model equations</w:t>
+      </w:r>
+    </w:p>
+    <w:p>
+      <w:pPr/>
+      <w:r>
+        <w:br w:type="page"/>
+      </w:r>
+    </w:p>
     <w:p>
       <w:pPr>
         <w:pStyle w:val="Heading1"/>
@@ -2379,7 +3331,7 @@
         </w:rPr>
         <w:t xml:space="preserve">Table </w:t>
       </w:r>
-      <w:bookmarkStart w:id="51052f60-0e62-441c-b391-0c7ad367095e" w:name="pest_table"/>
+      <w:bookmarkStart w:id="dd74d510-fbfd-476b-a91d-61ae34e38998" w:name="pest_table"/>
       <w:r>
         <w:rPr/>
         <w:t xml:space="preserve"/>
@@ -2400,7 +3352,7 @@
         <w:rPr/>
         <w:t xml:space="preserve"/>
       </w:r>
-      <w:bookmarkEnd w:id="51052f60-0e62-441c-b391-0c7ad367095e"/>
+      <w:bookmarkEnd w:id="dd74d510-fbfd-476b-a91d-61ae34e38998"/>
       <w:r>
         <w:rPr>
           <w:rFonts/>
@@ -2449,109 +3401,6 @@
         <w:drawing>
           <wp:inline distT="0" distB="0" distL="0" distR="0">
             <wp:extent cx="7315200" cy="3840480"/>
-            <wp:docPr id="1" name="" descr=""/>
-            <wp:cNvGraphicFramePr>
-              <a:graphicFrameLocks xmlns:a="http://schemas.openxmlformats.org/drawingml/2006/main" noChangeAspect="1"/>
-            </wp:cNvGraphicFramePr>
-            <a:graphic xmlns:a="http://schemas.openxmlformats.org/drawingml/2006/main">
-              <a:graphicData uri="http://schemas.openxmlformats.org/drawingml/2006/picture">
-                <pic:pic xmlns:pic="http://schemas.openxmlformats.org/drawingml/2006/picture">
-                  <pic:nvPicPr>
-                    <pic:cNvPr id="2" name=""/>
-                    <pic:cNvPicPr>
-                      <a:picLocks noChangeAspect="1" noChangeArrowheads="1"/>
-                    </pic:cNvPicPr>
-                  </pic:nvPicPr>
-                  <pic:blipFill>
-                    <a:blip r:embed="rId16"/>
-                    <a:stretch>
-                      <a:fillRect/>
-                    </a:stretch>
-                  </pic:blipFill>
-                  <pic:spPr bwMode="auto">
-                    <a:xfrm>
-                      <a:off x="0" y="0"/>
-                      <a:ext cx="7315200" cy="3840480"/>
-                    </a:xfrm>
-                    <a:prstGeom prst="rect">
-                      <a:avLst/>
-                    </a:prstGeom>
-                    <a:noFill/>
-                  </pic:spPr>
-                </pic:pic>
-              </a:graphicData>
-            </a:graphic>
-          </wp:inline>
-        </w:drawing>
-      </w:r>
-    </w:p>
-    <w:p>
-      <w:pPr>
-        <w:pStyle w:val="graphictitle"/>
-      </w:pPr>
-      <w:r>
-        <w:rPr>
-          <w:rFonts/>
-          <w:strike w:val="false"/>
-        </w:rPr>
-        <w:t xml:space="preserve">Figure </w:t>
-      </w:r>
-      <w:bookmarkStart w:id="9f3589b0-4c09-401a-8445-aefbf9919876" w:name="ind_plots"/>
-      <w:r>
-        <w:rPr/>
-        <w:t xml:space="preserve"/>
-      </w:r>
-      <w:r>
-        <w:rPr/>
-        <w:fldChar w:fldCharType="begin" w:dirty="true"/>
-      </w:r>
-      <w:r>
-        <w:rPr/>
-        <w:instrText xml:space="preserve" w:dirty="true">SEQ Figure \* Arabic</w:instrText>
-      </w:r>
-      <w:r>
-        <w:rPr/>
-        <w:fldChar w:fldCharType="end" w:dirty="true"/>
-      </w:r>
-      <w:r>
-        <w:rPr/>
-        <w:t xml:space="preserve"/>
-      </w:r>
-      <w:bookmarkEnd w:id="9f3589b0-4c09-401a-8445-aefbf9919876"/>
-      <w:r>
-        <w:rPr>
-          <w:rFonts/>
-          <w:strike w:val="false"/>
-        </w:rPr>
-        <w:t xml:space="preserve">. </w:t>
-      </w:r>
-      <w:r>
-        <w:rPr>
-          <w:rFonts/>
-          <w:strike w:val="false"/>
-        </w:rPr>
-        <w:t xml:space="preserve">Individual and population prediction overlay</w:t>
-      </w:r>
-    </w:p>
-    <w:p>
-      <w:pPr>
-        <w:sectPr>
-          <w:pgMar w:header="708" w:bottom="1417" w:top="1417" w:right="1417" w:left="1417" w:footer="708" w:gutter="0"/>
-          <w:pgSz w:h="11906" w:w="16838" w:orient="landscape"/>
-          <w:type w:val="oddPage"/>
-          <w:cols/>
-        </w:sectPr>
-      </w:pPr>
-    </w:p>
-    <w:p>
-      <w:pPr>
-        <w:pStyle w:val="Normal"/>
-      </w:pPr>
-      <w:r>
-        <w:rPr/>
-        <w:drawing>
-          <wp:inline distT="0" distB="0" distL="0" distR="0">
-            <wp:extent cx="5943600" cy="5486400"/>
             <wp:docPr id="3" name="" descr=""/>
             <wp:cNvGraphicFramePr>
               <a:graphicFrameLocks xmlns:a="http://schemas.openxmlformats.org/drawingml/2006/main" noChangeAspect="1"/>
@@ -2574,7 +3423,7 @@
                   <pic:spPr bwMode="auto">
                     <a:xfrm>
                       <a:off x="0" y="0"/>
-                      <a:ext cx="5943600" cy="5486400"/>
+                      <a:ext cx="7315200" cy="3840480"/>
                     </a:xfrm>
                     <a:prstGeom prst="rect">
                       <a:avLst/>
@@ -2599,7 +3448,7 @@
         </w:rPr>
         <w:t xml:space="preserve">Figure </w:t>
       </w:r>
-      <w:bookmarkStart w:id="bbe8cfac-aa87-4daf-ad6d-1d2d9911ad98" w:name="dv_vs_pred_ipred"/>
+      <w:bookmarkStart w:id="de3e65f8-9a56-4c32-a2dd-5c5d9bb82ea7" w:name="ind_plots"/>
       <w:r>
         <w:rPr/>
         <w:t xml:space="preserve"/>
@@ -2620,7 +3469,7 @@
         <w:rPr/>
         <w:t xml:space="preserve"/>
       </w:r>
-      <w:bookmarkEnd w:id="bbe8cfac-aa87-4daf-ad6d-1d2d9911ad98"/>
+      <w:bookmarkEnd w:id="de3e65f8-9a56-4c32-a2dd-5c5d9bb82ea7"/>
       <w:r>
         <w:rPr>
           <w:rFonts/>
@@ -2633,20 +3482,14 @@
           <w:rFonts/>
           <w:strike w:val="false"/>
         </w:rPr>
-        <w:t xml:space="preserve">Observed vs Predicted</w:t>
-      </w:r>
-    </w:p>
-    <w:p>
-      <w:pPr/>
-      <w:r>
-        <w:br w:type="page"/>
+        <w:t xml:space="preserve">Individual and population prediction overlay</w:t>
       </w:r>
     </w:p>
     <w:p>
       <w:pPr>
         <w:sectPr>
           <w:pgMar w:header="708" w:bottom="1417" w:top="1417" w:right="1417" w:left="1417" w:footer="708" w:gutter="0"/>
-          <w:pgSz w:h="16838" w:w="11906" w:orient="portrait"/>
+          <w:pgSz w:h="11906" w:w="16838" w:orient="landscape"/>
           <w:type w:val="oddPage"/>
           <w:cols/>
         </w:sectPr>
@@ -2660,7 +3503,7 @@
         <w:rPr/>
         <w:drawing>
           <wp:inline distT="0" distB="0" distL="0" distR="0">
-            <wp:extent cx="7315200" cy="3840480"/>
+            <wp:extent cx="5943600" cy="5486400"/>
             <wp:docPr id="5" name="" descr=""/>
             <wp:cNvGraphicFramePr>
               <a:graphicFrameLocks xmlns:a="http://schemas.openxmlformats.org/drawingml/2006/main" noChangeAspect="1"/>
@@ -2683,6 +3526,115 @@
                   <pic:spPr bwMode="auto">
                     <a:xfrm>
                       <a:off x="0" y="0"/>
+                      <a:ext cx="5943600" cy="5486400"/>
+                    </a:xfrm>
+                    <a:prstGeom prst="rect">
+                      <a:avLst/>
+                    </a:prstGeom>
+                    <a:noFill/>
+                  </pic:spPr>
+                </pic:pic>
+              </a:graphicData>
+            </a:graphic>
+          </wp:inline>
+        </w:drawing>
+      </w:r>
+    </w:p>
+    <w:p>
+      <w:pPr>
+        <w:pStyle w:val="graphictitle"/>
+      </w:pPr>
+      <w:r>
+        <w:rPr>
+          <w:rFonts/>
+          <w:strike w:val="false"/>
+        </w:rPr>
+        <w:t xml:space="preserve">Figure </w:t>
+      </w:r>
+      <w:bookmarkStart w:id="c37ae898-2450-447f-a8dc-a63819f7a2d2" w:name="dv_vs_pred_ipred"/>
+      <w:r>
+        <w:rPr/>
+        <w:t xml:space="preserve"/>
+      </w:r>
+      <w:r>
+        <w:rPr/>
+        <w:fldChar w:fldCharType="begin" w:dirty="true"/>
+      </w:r>
+      <w:r>
+        <w:rPr/>
+        <w:instrText xml:space="preserve" w:dirty="true">SEQ Figure \* Arabic</w:instrText>
+      </w:r>
+      <w:r>
+        <w:rPr/>
+        <w:fldChar w:fldCharType="end" w:dirty="true"/>
+      </w:r>
+      <w:r>
+        <w:rPr/>
+        <w:t xml:space="preserve"/>
+      </w:r>
+      <w:bookmarkEnd w:id="c37ae898-2450-447f-a8dc-a63819f7a2d2"/>
+      <w:r>
+        <w:rPr>
+          <w:rFonts/>
+          <w:strike w:val="false"/>
+        </w:rPr>
+        <w:t xml:space="preserve">. </w:t>
+      </w:r>
+      <w:r>
+        <w:rPr>
+          <w:rFonts/>
+          <w:strike w:val="false"/>
+        </w:rPr>
+        <w:t xml:space="preserve">Observed vs Predicted</w:t>
+      </w:r>
+    </w:p>
+    <w:p>
+      <w:pPr/>
+      <w:r>
+        <w:br w:type="page"/>
+      </w:r>
+    </w:p>
+    <w:p>
+      <w:pPr>
+        <w:sectPr>
+          <w:pgMar w:header="708" w:bottom="1417" w:top="1417" w:right="1417" w:left="1417" w:footer="708" w:gutter="0"/>
+          <w:pgSz w:h="16838" w:w="11906" w:orient="portrait"/>
+          <w:type w:val="oddPage"/>
+          <w:cols/>
+        </w:sectPr>
+      </w:pPr>
+    </w:p>
+    <w:p>
+      <w:pPr>
+        <w:pStyle w:val="Normal"/>
+      </w:pPr>
+      <w:r>
+        <w:rPr/>
+        <w:drawing>
+          <wp:inline distT="0" distB="0" distL="0" distR="0">
+            <wp:extent cx="7315200" cy="3840480"/>
+            <wp:docPr id="7" name="" descr=""/>
+            <wp:cNvGraphicFramePr>
+              <a:graphicFrameLocks xmlns:a="http://schemas.openxmlformats.org/drawingml/2006/main" noChangeAspect="1"/>
+            </wp:cNvGraphicFramePr>
+            <a:graphic xmlns:a="http://schemas.openxmlformats.org/drawingml/2006/main">
+              <a:graphicData uri="http://schemas.openxmlformats.org/drawingml/2006/picture">
+                <pic:pic xmlns:pic="http://schemas.openxmlformats.org/drawingml/2006/picture">
+                  <pic:nvPicPr>
+                    <pic:cNvPr id="8" name=""/>
+                    <pic:cNvPicPr>
+                      <a:picLocks noChangeAspect="1" noChangeArrowheads="1"/>
+                    </pic:cNvPicPr>
+                  </pic:nvPicPr>
+                  <pic:blipFill>
+                    <a:blip r:embed="rId19"/>
+                    <a:stretch>
+                      <a:fillRect/>
+                    </a:stretch>
+                  </pic:blipFill>
+                  <pic:spPr bwMode="auto">
+                    <a:xfrm>
+                      <a:off x="0" y="0"/>
                       <a:ext cx="7315200" cy="3840480"/>
                     </a:xfrm>
                     <a:prstGeom prst="rect">
@@ -2708,7 +3660,7 @@
         </w:rPr>
         <w:t xml:space="preserve">Figure </w:t>
       </w:r>
-      <w:bookmarkStart w:id="1693e7f5-8a3e-422e-808b-55c40dd0ac84" w:name="prm_vs_iteration"/>
+      <w:bookmarkStart w:id="4c5ea179-07d4-4734-a69b-b0cd77fc3a17" w:name="prm_vs_iteration"/>
       <w:r>
         <w:rPr/>
         <w:t xml:space="preserve"/>
@@ -2729,7 +3681,7 @@
         <w:rPr/>
         <w:t xml:space="preserve"/>
       </w:r>
-      <w:bookmarkEnd w:id="1693e7f5-8a3e-422e-808b-55c40dd0ac84"/>
+      <w:bookmarkEnd w:id="4c5ea179-07d4-4734-a69b-b0cd77fc3a17"/>
       <w:r>
         <w:rPr>
           <w:rFonts/>

</xml_diff>

<commit_message>
Deploying to gh-pages from @ nlmixr2/monolix2rx@4aa64baa529d1565ed3df5188d81035af1cb7bfd 🚀
</commit_message>
<xml_diff>
--- a/articles/mod-Word.docx
+++ b/articles/mod-Word.docx
@@ -67,7 +67,7 @@
         </w:rPr>
         <w:t xml:space="preserve">Figure </w:t>
       </w:r>
-      <w:bookmarkStart w:id="1a47d327-473c-48cc-903d-083292be502c" w:name="model_diagram"/>
+      <w:bookmarkStart w:id="83d3c124-39c2-40b5-9cfa-01efd6b0a035" w:name="model_diagram"/>
       <w:r>
         <w:rPr/>
         <w:t xml:space="preserve"/>
@@ -88,7 +88,7 @@
         <w:rPr/>
         <w:t xml:space="preserve"/>
       </w:r>
-      <w:bookmarkEnd w:id="1a47d327-473c-48cc-903d-083292be502c"/>
+      <w:bookmarkEnd w:id="83d3c124-39c2-40b5-9cfa-01efd6b0a035"/>
       <w:r>
         <w:rPr>
           <w:rFonts/>
@@ -912,7 +912,7 @@
         </w:rPr>
         <w:t xml:space="preserve">Table </w:t>
       </w:r>
-      <w:bookmarkStart w:id="d6b19e51-964a-400e-b76e-6341d43bf3d1" w:name="model_equations"/>
+      <w:bookmarkStart w:id="77f8e47f-d4d4-4914-baa2-1a6093a6a109" w:name="model_equations"/>
       <w:r>
         <w:rPr/>
         <w:t xml:space="preserve"/>
@@ -933,7 +933,7 @@
         <w:rPr/>
         <w:t xml:space="preserve"/>
       </w:r>
-      <w:bookmarkEnd w:id="d6b19e51-964a-400e-b76e-6341d43bf3d1"/>
+      <w:bookmarkEnd w:id="77f8e47f-d4d4-4914-baa2-1a6093a6a109"/>
       <w:r>
         <w:rPr>
           <w:rFonts/>
@@ -3331,7 +3331,7 @@
         </w:rPr>
         <w:t xml:space="preserve">Table </w:t>
       </w:r>
-      <w:bookmarkStart w:id="dd74d510-fbfd-476b-a91d-61ae34e38998" w:name="pest_table"/>
+      <w:bookmarkStart w:id="6950ceb1-e749-4a40-a3c9-2912f4f069b4" w:name="pest_table"/>
       <w:r>
         <w:rPr/>
         <w:t xml:space="preserve"/>
@@ -3352,7 +3352,7 @@
         <w:rPr/>
         <w:t xml:space="preserve"/>
       </w:r>
-      <w:bookmarkEnd w:id="dd74d510-fbfd-476b-a91d-61ae34e38998"/>
+      <w:bookmarkEnd w:id="6950ceb1-e749-4a40-a3c9-2912f4f069b4"/>
       <w:r>
         <w:rPr>
           <w:rFonts/>
@@ -3448,7 +3448,7 @@
         </w:rPr>
         <w:t xml:space="preserve">Figure </w:t>
       </w:r>
-      <w:bookmarkStart w:id="de3e65f8-9a56-4c32-a2dd-5c5d9bb82ea7" w:name="ind_plots"/>
+      <w:bookmarkStart w:id="5919866e-0a03-4b61-b7d6-bea778d481c8" w:name="ind_plots"/>
       <w:r>
         <w:rPr/>
         <w:t xml:space="preserve"/>
@@ -3469,7 +3469,7 @@
         <w:rPr/>
         <w:t xml:space="preserve"/>
       </w:r>
-      <w:bookmarkEnd w:id="de3e65f8-9a56-4c32-a2dd-5c5d9bb82ea7"/>
+      <w:bookmarkEnd w:id="5919866e-0a03-4b61-b7d6-bea778d481c8"/>
       <w:r>
         <w:rPr>
           <w:rFonts/>
@@ -3551,7 +3551,7 @@
         </w:rPr>
         <w:t xml:space="preserve">Figure </w:t>
       </w:r>
-      <w:bookmarkStart w:id="c37ae898-2450-447f-a8dc-a63819f7a2d2" w:name="dv_vs_pred_ipred"/>
+      <w:bookmarkStart w:id="2078ca42-05a8-4b88-9f84-b3aff20468df" w:name="dv_vs_pred_ipred"/>
       <w:r>
         <w:rPr/>
         <w:t xml:space="preserve"/>
@@ -3572,7 +3572,7 @@
         <w:rPr/>
         <w:t xml:space="preserve"/>
       </w:r>
-      <w:bookmarkEnd w:id="c37ae898-2450-447f-a8dc-a63819f7a2d2"/>
+      <w:bookmarkEnd w:id="2078ca42-05a8-4b88-9f84-b3aff20468df"/>
       <w:r>
         <w:rPr>
           <w:rFonts/>
@@ -3660,7 +3660,7 @@
         </w:rPr>
         <w:t xml:space="preserve">Figure </w:t>
       </w:r>
-      <w:bookmarkStart w:id="4c5ea179-07d4-4734-a69b-b0cd77fc3a17" w:name="prm_vs_iteration"/>
+      <w:bookmarkStart w:id="cfe46687-c7d1-4fe4-8535-97d124c0568f" w:name="prm_vs_iteration"/>
       <w:r>
         <w:rPr/>
         <w:t xml:space="preserve"/>
@@ -3681,7 +3681,7 @@
         <w:rPr/>
         <w:t xml:space="preserve"/>
       </w:r>
-      <w:bookmarkEnd w:id="4c5ea179-07d4-4734-a69b-b0cd77fc3a17"/>
+      <w:bookmarkEnd w:id="cfe46687-c7d1-4fe4-8535-97d124c0568f"/>
       <w:r>
         <w:rPr>
           <w:rFonts/>

</xml_diff>

<commit_message>
Deploying to gh-pages from @ nlmixr2/monolix2rx@948b0d1dbf3304b1188e6d700dbfd36e7340b9e8 🚀
</commit_message>
<xml_diff>
--- a/articles/mod-Word.docx
+++ b/articles/mod-Word.docx
@@ -67,7 +67,7 @@
         </w:rPr>
         <w:t xml:space="preserve">Figure </w:t>
       </w:r>
-      <w:bookmarkStart w:id="83d3c124-39c2-40b5-9cfa-01efd6b0a035" w:name="model_diagram"/>
+      <w:bookmarkStart w:id="b3a5071f-8b54-4eba-8f13-9c3cf1533e3b" w:name="model_diagram"/>
       <w:r>
         <w:rPr/>
         <w:t xml:space="preserve"/>
@@ -88,7 +88,7 @@
         <w:rPr/>
         <w:t xml:space="preserve"/>
       </w:r>
-      <w:bookmarkEnd w:id="83d3c124-39c2-40b5-9cfa-01efd6b0a035"/>
+      <w:bookmarkEnd w:id="b3a5071f-8b54-4eba-8f13-9c3cf1533e3b"/>
       <w:r>
         <w:rPr>
           <w:rFonts/>
@@ -912,7 +912,7 @@
         </w:rPr>
         <w:t xml:space="preserve">Table </w:t>
       </w:r>
-      <w:bookmarkStart w:id="77f8e47f-d4d4-4914-baa2-1a6093a6a109" w:name="model_equations"/>
+      <w:bookmarkStart w:id="5ee39648-3b9d-4353-beea-f78e06bc724c" w:name="model_equations"/>
       <w:r>
         <w:rPr/>
         <w:t xml:space="preserve"/>
@@ -933,7 +933,7 @@
         <w:rPr/>
         <w:t xml:space="preserve"/>
       </w:r>
-      <w:bookmarkEnd w:id="77f8e47f-d4d4-4914-baa2-1a6093a6a109"/>
+      <w:bookmarkEnd w:id="5ee39648-3b9d-4353-beea-f78e06bc724c"/>
       <w:r>
         <w:rPr>
           <w:rFonts/>
@@ -3331,7 +3331,7 @@
         </w:rPr>
         <w:t xml:space="preserve">Table </w:t>
       </w:r>
-      <w:bookmarkStart w:id="6950ceb1-e749-4a40-a3c9-2912f4f069b4" w:name="pest_table"/>
+      <w:bookmarkStart w:id="6bd85505-b54b-426d-b7a2-c6a8437c19a6" w:name="pest_table"/>
       <w:r>
         <w:rPr/>
         <w:t xml:space="preserve"/>
@@ -3352,7 +3352,7 @@
         <w:rPr/>
         <w:t xml:space="preserve"/>
       </w:r>
-      <w:bookmarkEnd w:id="6950ceb1-e749-4a40-a3c9-2912f4f069b4"/>
+      <w:bookmarkEnd w:id="6bd85505-b54b-426d-b7a2-c6a8437c19a6"/>
       <w:r>
         <w:rPr>
           <w:rFonts/>
@@ -3448,7 +3448,7 @@
         </w:rPr>
         <w:t xml:space="preserve">Figure </w:t>
       </w:r>
-      <w:bookmarkStart w:id="5919866e-0a03-4b61-b7d6-bea778d481c8" w:name="ind_plots"/>
+      <w:bookmarkStart w:id="6ba32112-a724-4291-90ee-e752c8f77bda" w:name="ind_plots"/>
       <w:r>
         <w:rPr/>
         <w:t xml:space="preserve"/>
@@ -3469,7 +3469,7 @@
         <w:rPr/>
         <w:t xml:space="preserve"/>
       </w:r>
-      <w:bookmarkEnd w:id="5919866e-0a03-4b61-b7d6-bea778d481c8"/>
+      <w:bookmarkEnd w:id="6ba32112-a724-4291-90ee-e752c8f77bda"/>
       <w:r>
         <w:rPr>
           <w:rFonts/>
@@ -3551,7 +3551,7 @@
         </w:rPr>
         <w:t xml:space="preserve">Figure </w:t>
       </w:r>
-      <w:bookmarkStart w:id="2078ca42-05a8-4b88-9f84-b3aff20468df" w:name="dv_vs_pred_ipred"/>
+      <w:bookmarkStart w:id="93c2333d-45f4-4904-ae4e-b5cb385e63b9" w:name="dv_vs_pred_ipred"/>
       <w:r>
         <w:rPr/>
         <w:t xml:space="preserve"/>
@@ -3572,7 +3572,7 @@
         <w:rPr/>
         <w:t xml:space="preserve"/>
       </w:r>
-      <w:bookmarkEnd w:id="2078ca42-05a8-4b88-9f84-b3aff20468df"/>
+      <w:bookmarkEnd w:id="93c2333d-45f4-4904-ae4e-b5cb385e63b9"/>
       <w:r>
         <w:rPr>
           <w:rFonts/>
@@ -3660,7 +3660,7 @@
         </w:rPr>
         <w:t xml:space="preserve">Figure </w:t>
       </w:r>
-      <w:bookmarkStart w:id="cfe46687-c7d1-4fe4-8535-97d124c0568f" w:name="prm_vs_iteration"/>
+      <w:bookmarkStart w:id="721a3bc4-8638-4639-b3e8-8047c896ce0d" w:name="prm_vs_iteration"/>
       <w:r>
         <w:rPr/>
         <w:t xml:space="preserve"/>
@@ -3681,7 +3681,7 @@
         <w:rPr/>
         <w:t xml:space="preserve"/>
       </w:r>
-      <w:bookmarkEnd w:id="cfe46687-c7d1-4fe4-8535-97d124c0568f"/>
+      <w:bookmarkEnd w:id="721a3bc4-8638-4639-b3e8-8047c896ce0d"/>
       <w:r>
         <w:rPr>
           <w:rFonts/>

</xml_diff>

<commit_message>
Deploying to gh-pages from @ nlmixr2/monolix2rx@32c1212771ed53738b21615f34d26f46faabb4ce 🚀
</commit_message>
<xml_diff>
--- a/articles/mod-Word.docx
+++ b/articles/mod-Word.docx
@@ -67,7 +67,7 @@
         </w:rPr>
         <w:t xml:space="preserve">Figure </w:t>
       </w:r>
-      <w:bookmarkStart w:id="b3a5071f-8b54-4eba-8f13-9c3cf1533e3b" w:name="model_diagram"/>
+      <w:bookmarkStart w:id="66f68373-4fd4-445a-b054-1ace53a4490c" w:name="model_diagram"/>
       <w:r>
         <w:rPr/>
         <w:t xml:space="preserve"/>
@@ -88,7 +88,7 @@
         <w:rPr/>
         <w:t xml:space="preserve"/>
       </w:r>
-      <w:bookmarkEnd w:id="b3a5071f-8b54-4eba-8f13-9c3cf1533e3b"/>
+      <w:bookmarkEnd w:id="66f68373-4fd4-445a-b054-1ace53a4490c"/>
       <w:r>
         <w:rPr>
           <w:rFonts/>
@@ -912,7 +912,7 @@
         </w:rPr>
         <w:t xml:space="preserve">Table </w:t>
       </w:r>
-      <w:bookmarkStart w:id="5ee39648-3b9d-4353-beea-f78e06bc724c" w:name="model_equations"/>
+      <w:bookmarkStart w:id="80b8da75-e18b-4992-b086-5d23e7bfb001" w:name="model_equations"/>
       <w:r>
         <w:rPr/>
         <w:t xml:space="preserve"/>
@@ -933,7 +933,7 @@
         <w:rPr/>
         <w:t xml:space="preserve"/>
       </w:r>
-      <w:bookmarkEnd w:id="5ee39648-3b9d-4353-beea-f78e06bc724c"/>
+      <w:bookmarkEnd w:id="80b8da75-e18b-4992-b086-5d23e7bfb001"/>
       <w:r>
         <w:rPr>
           <w:rFonts/>
@@ -3331,7 +3331,7 @@
         </w:rPr>
         <w:t xml:space="preserve">Table </w:t>
       </w:r>
-      <w:bookmarkStart w:id="6bd85505-b54b-426d-b7a2-c6a8437c19a6" w:name="pest_table"/>
+      <w:bookmarkStart w:id="0c2a267b-9837-4cf0-be47-d8e9bceaf9ed" w:name="pest_table"/>
       <w:r>
         <w:rPr/>
         <w:t xml:space="preserve"/>
@@ -3352,7 +3352,7 @@
         <w:rPr/>
         <w:t xml:space="preserve"/>
       </w:r>
-      <w:bookmarkEnd w:id="6bd85505-b54b-426d-b7a2-c6a8437c19a6"/>
+      <w:bookmarkEnd w:id="0c2a267b-9837-4cf0-be47-d8e9bceaf9ed"/>
       <w:r>
         <w:rPr>
           <w:rFonts/>
@@ -3448,7 +3448,7 @@
         </w:rPr>
         <w:t xml:space="preserve">Figure </w:t>
       </w:r>
-      <w:bookmarkStart w:id="6ba32112-a724-4291-90ee-e752c8f77bda" w:name="ind_plots"/>
+      <w:bookmarkStart w:id="48806a3d-90bb-4bf9-b498-6d60644ac5de" w:name="ind_plots"/>
       <w:r>
         <w:rPr/>
         <w:t xml:space="preserve"/>
@@ -3469,7 +3469,7 @@
         <w:rPr/>
         <w:t xml:space="preserve"/>
       </w:r>
-      <w:bookmarkEnd w:id="6ba32112-a724-4291-90ee-e752c8f77bda"/>
+      <w:bookmarkEnd w:id="48806a3d-90bb-4bf9-b498-6d60644ac5de"/>
       <w:r>
         <w:rPr>
           <w:rFonts/>
@@ -3551,7 +3551,7 @@
         </w:rPr>
         <w:t xml:space="preserve">Figure </w:t>
       </w:r>
-      <w:bookmarkStart w:id="93c2333d-45f4-4904-ae4e-b5cb385e63b9" w:name="dv_vs_pred_ipred"/>
+      <w:bookmarkStart w:id="43d7f985-c2db-448a-b2ba-af8535680647" w:name="dv_vs_pred_ipred"/>
       <w:r>
         <w:rPr/>
         <w:t xml:space="preserve"/>
@@ -3572,7 +3572,7 @@
         <w:rPr/>
         <w:t xml:space="preserve"/>
       </w:r>
-      <w:bookmarkEnd w:id="93c2333d-45f4-4904-ae4e-b5cb385e63b9"/>
+      <w:bookmarkEnd w:id="43d7f985-c2db-448a-b2ba-af8535680647"/>
       <w:r>
         <w:rPr>
           <w:rFonts/>
@@ -3660,7 +3660,7 @@
         </w:rPr>
         <w:t xml:space="preserve">Figure </w:t>
       </w:r>
-      <w:bookmarkStart w:id="721a3bc4-8638-4639-b3e8-8047c896ce0d" w:name="prm_vs_iteration"/>
+      <w:bookmarkStart w:id="0e1d9333-aa4f-44bf-9193-fdfc6e6c1b27" w:name="prm_vs_iteration"/>
       <w:r>
         <w:rPr/>
         <w:t xml:space="preserve"/>
@@ -3681,7 +3681,7 @@
         <w:rPr/>
         <w:t xml:space="preserve"/>
       </w:r>
-      <w:bookmarkEnd w:id="721a3bc4-8638-4639-b3e8-8047c896ce0d"/>
+      <w:bookmarkEnd w:id="0e1d9333-aa4f-44bf-9193-fdfc6e6c1b27"/>
       <w:r>
         <w:rPr>
           <w:rFonts/>

</xml_diff>

<commit_message>
Deploying to gh-pages from @ nlmixr2/monolix2rx@8c98c50d47181d8185a84e90c40cf3b60133915b 🚀
</commit_message>
<xml_diff>
--- a/articles/mod-Word.docx
+++ b/articles/mod-Word.docx
@@ -67,7 +67,7 @@
         </w:rPr>
         <w:t xml:space="preserve">Figure </w:t>
       </w:r>
-      <w:bookmarkStart w:id="66f68373-4fd4-445a-b054-1ace53a4490c" w:name="model_diagram"/>
+      <w:bookmarkStart w:id="4903500a-bdf0-40b1-b65c-bb4e1bd21cc0" w:name="model_diagram"/>
       <w:r>
         <w:rPr/>
         <w:t xml:space="preserve"/>
@@ -88,7 +88,7 @@
         <w:rPr/>
         <w:t xml:space="preserve"/>
       </w:r>
-      <w:bookmarkEnd w:id="66f68373-4fd4-445a-b054-1ace53a4490c"/>
+      <w:bookmarkEnd w:id="4903500a-bdf0-40b1-b65c-bb4e1bd21cc0"/>
       <w:r>
         <w:rPr>
           <w:rFonts/>
@@ -912,7 +912,7 @@
         </w:rPr>
         <w:t xml:space="preserve">Table </w:t>
       </w:r>
-      <w:bookmarkStart w:id="80b8da75-e18b-4992-b086-5d23e7bfb001" w:name="model_equations"/>
+      <w:bookmarkStart w:id="e3a5716a-9639-46fc-9393-a827d701116c" w:name="model_equations"/>
       <w:r>
         <w:rPr/>
         <w:t xml:space="preserve"/>
@@ -933,7 +933,7 @@
         <w:rPr/>
         <w:t xml:space="preserve"/>
       </w:r>
-      <w:bookmarkEnd w:id="80b8da75-e18b-4992-b086-5d23e7bfb001"/>
+      <w:bookmarkEnd w:id="e3a5716a-9639-46fc-9393-a827d701116c"/>
       <w:r>
         <w:rPr>
           <w:rFonts/>
@@ -3331,7 +3331,7 @@
         </w:rPr>
         <w:t xml:space="preserve">Table </w:t>
       </w:r>
-      <w:bookmarkStart w:id="0c2a267b-9837-4cf0-be47-d8e9bceaf9ed" w:name="pest_table"/>
+      <w:bookmarkStart w:id="c404bdbd-dead-44b5-9145-2f63afd1440c" w:name="pest_table"/>
       <w:r>
         <w:rPr/>
         <w:t xml:space="preserve"/>
@@ -3352,7 +3352,7 @@
         <w:rPr/>
         <w:t xml:space="preserve"/>
       </w:r>
-      <w:bookmarkEnd w:id="0c2a267b-9837-4cf0-be47-d8e9bceaf9ed"/>
+      <w:bookmarkEnd w:id="c404bdbd-dead-44b5-9145-2f63afd1440c"/>
       <w:r>
         <w:rPr>
           <w:rFonts/>
@@ -3448,7 +3448,7 @@
         </w:rPr>
         <w:t xml:space="preserve">Figure </w:t>
       </w:r>
-      <w:bookmarkStart w:id="48806a3d-90bb-4bf9-b498-6d60644ac5de" w:name="ind_plots"/>
+      <w:bookmarkStart w:id="3d599090-9f20-49dc-bd6e-7fe913d6e8d2" w:name="ind_plots"/>
       <w:r>
         <w:rPr/>
         <w:t xml:space="preserve"/>
@@ -3469,7 +3469,7 @@
         <w:rPr/>
         <w:t xml:space="preserve"/>
       </w:r>
-      <w:bookmarkEnd w:id="48806a3d-90bb-4bf9-b498-6d60644ac5de"/>
+      <w:bookmarkEnd w:id="3d599090-9f20-49dc-bd6e-7fe913d6e8d2"/>
       <w:r>
         <w:rPr>
           <w:rFonts/>
@@ -3551,7 +3551,7 @@
         </w:rPr>
         <w:t xml:space="preserve">Figure </w:t>
       </w:r>
-      <w:bookmarkStart w:id="43d7f985-c2db-448a-b2ba-af8535680647" w:name="dv_vs_pred_ipred"/>
+      <w:bookmarkStart w:id="02fa3029-dde9-4a33-af43-9859aa3e4ef8" w:name="dv_vs_pred_ipred"/>
       <w:r>
         <w:rPr/>
         <w:t xml:space="preserve"/>
@@ -3572,7 +3572,7 @@
         <w:rPr/>
         <w:t xml:space="preserve"/>
       </w:r>
-      <w:bookmarkEnd w:id="43d7f985-c2db-448a-b2ba-af8535680647"/>
+      <w:bookmarkEnd w:id="02fa3029-dde9-4a33-af43-9859aa3e4ef8"/>
       <w:r>
         <w:rPr>
           <w:rFonts/>
@@ -3660,7 +3660,7 @@
         </w:rPr>
         <w:t xml:space="preserve">Figure </w:t>
       </w:r>
-      <w:bookmarkStart w:id="0e1d9333-aa4f-44bf-9193-fdfc6e6c1b27" w:name="prm_vs_iteration"/>
+      <w:bookmarkStart w:id="8c00c017-8a8e-495c-9f8c-8d0c439988c1" w:name="prm_vs_iteration"/>
       <w:r>
         <w:rPr/>
         <w:t xml:space="preserve"/>
@@ -3681,7 +3681,7 @@
         <w:rPr/>
         <w:t xml:space="preserve"/>
       </w:r>
-      <w:bookmarkEnd w:id="0e1d9333-aa4f-44bf-9193-fdfc6e6c1b27"/>
+      <w:bookmarkEnd w:id="8c00c017-8a8e-495c-9f8c-8d0c439988c1"/>
       <w:r>
         <w:rPr>
           <w:rFonts/>

</xml_diff>

<commit_message>
Deploying to gh-pages from @ nlmixr2/monolix2rx@612bb258ca35e97519dfb03d7751951b2179c577 🚀
</commit_message>
<xml_diff>
--- a/articles/mod-Word.docx
+++ b/articles/mod-Word.docx
@@ -67,7 +67,7 @@
         </w:rPr>
         <w:t xml:space="preserve">Figure </w:t>
       </w:r>
-      <w:bookmarkStart w:id="4903500a-bdf0-40b1-b65c-bb4e1bd21cc0" w:name="model_diagram"/>
+      <w:bookmarkStart w:id="a1a23772-14b8-453d-b90b-f9f60430d8c7" w:name="model_diagram"/>
       <w:r>
         <w:rPr/>
         <w:t xml:space="preserve"/>
@@ -88,7 +88,7 @@
         <w:rPr/>
         <w:t xml:space="preserve"/>
       </w:r>
-      <w:bookmarkEnd w:id="4903500a-bdf0-40b1-b65c-bb4e1bd21cc0"/>
+      <w:bookmarkEnd w:id="a1a23772-14b8-453d-b90b-f9f60430d8c7"/>
       <w:r>
         <w:rPr>
           <w:rFonts/>
@@ -912,7 +912,7 @@
         </w:rPr>
         <w:t xml:space="preserve">Table </w:t>
       </w:r>
-      <w:bookmarkStart w:id="e3a5716a-9639-46fc-9393-a827d701116c" w:name="model_equations"/>
+      <w:bookmarkStart w:id="520a24ef-c1a5-49df-96c2-e47a2f072ae6" w:name="model_equations"/>
       <w:r>
         <w:rPr/>
         <w:t xml:space="preserve"/>
@@ -933,7 +933,7 @@
         <w:rPr/>
         <w:t xml:space="preserve"/>
       </w:r>
-      <w:bookmarkEnd w:id="e3a5716a-9639-46fc-9393-a827d701116c"/>
+      <w:bookmarkEnd w:id="520a24ef-c1a5-49df-96c2-e47a2f072ae6"/>
       <w:r>
         <w:rPr>
           <w:rFonts/>
@@ -3331,7 +3331,7 @@
         </w:rPr>
         <w:t xml:space="preserve">Table </w:t>
       </w:r>
-      <w:bookmarkStart w:id="c404bdbd-dead-44b5-9145-2f63afd1440c" w:name="pest_table"/>
+      <w:bookmarkStart w:id="0f5b8680-7ae1-403f-8a13-94c87141e56a" w:name="pest_table"/>
       <w:r>
         <w:rPr/>
         <w:t xml:space="preserve"/>
@@ -3352,7 +3352,7 @@
         <w:rPr/>
         <w:t xml:space="preserve"/>
       </w:r>
-      <w:bookmarkEnd w:id="c404bdbd-dead-44b5-9145-2f63afd1440c"/>
+      <w:bookmarkEnd w:id="0f5b8680-7ae1-403f-8a13-94c87141e56a"/>
       <w:r>
         <w:rPr>
           <w:rFonts/>
@@ -3448,7 +3448,7 @@
         </w:rPr>
         <w:t xml:space="preserve">Figure </w:t>
       </w:r>
-      <w:bookmarkStart w:id="3d599090-9f20-49dc-bd6e-7fe913d6e8d2" w:name="ind_plots"/>
+      <w:bookmarkStart w:id="fa0d283f-e86b-4aea-974e-4d4737d86bd8" w:name="ind_plots"/>
       <w:r>
         <w:rPr/>
         <w:t xml:space="preserve"/>
@@ -3469,7 +3469,7 @@
         <w:rPr/>
         <w:t xml:space="preserve"/>
       </w:r>
-      <w:bookmarkEnd w:id="3d599090-9f20-49dc-bd6e-7fe913d6e8d2"/>
+      <w:bookmarkEnd w:id="fa0d283f-e86b-4aea-974e-4d4737d86bd8"/>
       <w:r>
         <w:rPr>
           <w:rFonts/>
@@ -3551,7 +3551,7 @@
         </w:rPr>
         <w:t xml:space="preserve">Figure </w:t>
       </w:r>
-      <w:bookmarkStart w:id="02fa3029-dde9-4a33-af43-9859aa3e4ef8" w:name="dv_vs_pred_ipred"/>
+      <w:bookmarkStart w:id="5b45fab2-d6e9-4d03-b721-8112f9e34148" w:name="dv_vs_pred_ipred"/>
       <w:r>
         <w:rPr/>
         <w:t xml:space="preserve"/>
@@ -3572,7 +3572,7 @@
         <w:rPr/>
         <w:t xml:space="preserve"/>
       </w:r>
-      <w:bookmarkEnd w:id="02fa3029-dde9-4a33-af43-9859aa3e4ef8"/>
+      <w:bookmarkEnd w:id="5b45fab2-d6e9-4d03-b721-8112f9e34148"/>
       <w:r>
         <w:rPr>
           <w:rFonts/>
@@ -3660,7 +3660,7 @@
         </w:rPr>
         <w:t xml:space="preserve">Figure </w:t>
       </w:r>
-      <w:bookmarkStart w:id="8c00c017-8a8e-495c-9f8c-8d0c439988c1" w:name="prm_vs_iteration"/>
+      <w:bookmarkStart w:id="8d5c10c9-60ff-419c-8212-0618e2c7453f" w:name="prm_vs_iteration"/>
       <w:r>
         <w:rPr/>
         <w:t xml:space="preserve"/>
@@ -3681,7 +3681,7 @@
         <w:rPr/>
         <w:t xml:space="preserve"/>
       </w:r>
-      <w:bookmarkEnd w:id="8c00c017-8a8e-495c-9f8c-8d0c439988c1"/>
+      <w:bookmarkEnd w:id="8d5c10c9-60ff-419c-8212-0618e2c7453f"/>
       <w:r>
         <w:rPr>
           <w:rFonts/>

</xml_diff>

<commit_message>
Deploying to gh-pages from @ nlmixr2/monolix2rx@aac7f928bcfdcf7407a05b4e6cc843d82c830c44 🚀
</commit_message>
<xml_diff>
--- a/articles/mod-Word.docx
+++ b/articles/mod-Word.docx
@@ -67,7 +67,7 @@
         </w:rPr>
         <w:t xml:space="preserve">Figure </w:t>
       </w:r>
-      <w:bookmarkStart w:id="a1a23772-14b8-453d-b90b-f9f60430d8c7" w:name="model_diagram"/>
+      <w:bookmarkStart w:id="9280481c-4153-4725-9056-e488e68f7116" w:name="model_diagram"/>
       <w:r>
         <w:rPr/>
         <w:t xml:space="preserve"/>
@@ -88,7 +88,7 @@
         <w:rPr/>
         <w:t xml:space="preserve"/>
       </w:r>
-      <w:bookmarkEnd w:id="a1a23772-14b8-453d-b90b-f9f60430d8c7"/>
+      <w:bookmarkEnd w:id="9280481c-4153-4725-9056-e488e68f7116"/>
       <w:r>
         <w:rPr>
           <w:rFonts/>
@@ -912,7 +912,7 @@
         </w:rPr>
         <w:t xml:space="preserve">Table </w:t>
       </w:r>
-      <w:bookmarkStart w:id="520a24ef-c1a5-49df-96c2-e47a2f072ae6" w:name="model_equations"/>
+      <w:bookmarkStart w:id="d65a28a6-9c74-4940-b520-e1e248626cea" w:name="model_equations"/>
       <w:r>
         <w:rPr/>
         <w:t xml:space="preserve"/>
@@ -933,7 +933,7 @@
         <w:rPr/>
         <w:t xml:space="preserve"/>
       </w:r>
-      <w:bookmarkEnd w:id="520a24ef-c1a5-49df-96c2-e47a2f072ae6"/>
+      <w:bookmarkEnd w:id="d65a28a6-9c74-4940-b520-e1e248626cea"/>
       <w:r>
         <w:rPr>
           <w:rFonts/>
@@ -3331,7 +3331,7 @@
         </w:rPr>
         <w:t xml:space="preserve">Table </w:t>
       </w:r>
-      <w:bookmarkStart w:id="0f5b8680-7ae1-403f-8a13-94c87141e56a" w:name="pest_table"/>
+      <w:bookmarkStart w:id="55f22f80-d281-4081-ac74-489e4b85afca" w:name="pest_table"/>
       <w:r>
         <w:rPr/>
         <w:t xml:space="preserve"/>
@@ -3352,7 +3352,7 @@
         <w:rPr/>
         <w:t xml:space="preserve"/>
       </w:r>
-      <w:bookmarkEnd w:id="0f5b8680-7ae1-403f-8a13-94c87141e56a"/>
+      <w:bookmarkEnd w:id="55f22f80-d281-4081-ac74-489e4b85afca"/>
       <w:r>
         <w:rPr>
           <w:rFonts/>
@@ -3448,7 +3448,7 @@
         </w:rPr>
         <w:t xml:space="preserve">Figure </w:t>
       </w:r>
-      <w:bookmarkStart w:id="fa0d283f-e86b-4aea-974e-4d4737d86bd8" w:name="ind_plots"/>
+      <w:bookmarkStart w:id="7764d0b0-ccad-4ea3-be79-6c1258eea2e0" w:name="ind_plots"/>
       <w:r>
         <w:rPr/>
         <w:t xml:space="preserve"/>
@@ -3469,7 +3469,7 @@
         <w:rPr/>
         <w:t xml:space="preserve"/>
       </w:r>
-      <w:bookmarkEnd w:id="fa0d283f-e86b-4aea-974e-4d4737d86bd8"/>
+      <w:bookmarkEnd w:id="7764d0b0-ccad-4ea3-be79-6c1258eea2e0"/>
       <w:r>
         <w:rPr>
           <w:rFonts/>
@@ -3551,7 +3551,7 @@
         </w:rPr>
         <w:t xml:space="preserve">Figure </w:t>
       </w:r>
-      <w:bookmarkStart w:id="5b45fab2-d6e9-4d03-b721-8112f9e34148" w:name="dv_vs_pred_ipred"/>
+      <w:bookmarkStart w:id="13b48533-845a-4661-bf8f-9d4c6607cb66" w:name="dv_vs_pred_ipred"/>
       <w:r>
         <w:rPr/>
         <w:t xml:space="preserve"/>
@@ -3572,7 +3572,7 @@
         <w:rPr/>
         <w:t xml:space="preserve"/>
       </w:r>
-      <w:bookmarkEnd w:id="5b45fab2-d6e9-4d03-b721-8112f9e34148"/>
+      <w:bookmarkEnd w:id="13b48533-845a-4661-bf8f-9d4c6607cb66"/>
       <w:r>
         <w:rPr>
           <w:rFonts/>
@@ -3660,7 +3660,7 @@
         </w:rPr>
         <w:t xml:space="preserve">Figure </w:t>
       </w:r>
-      <w:bookmarkStart w:id="8d5c10c9-60ff-419c-8212-0618e2c7453f" w:name="prm_vs_iteration"/>
+      <w:bookmarkStart w:id="8ce26607-8b88-4484-85bf-3aafee587f9a" w:name="prm_vs_iteration"/>
       <w:r>
         <w:rPr/>
         <w:t xml:space="preserve"/>
@@ -3681,7 +3681,7 @@
         <w:rPr/>
         <w:t xml:space="preserve"/>
       </w:r>
-      <w:bookmarkEnd w:id="8d5c10c9-60ff-419c-8212-0618e2c7453f"/>
+      <w:bookmarkEnd w:id="8ce26607-8b88-4484-85bf-3aafee587f9a"/>
       <w:r>
         <w:rPr>
           <w:rFonts/>

</xml_diff>

<commit_message>
Deploying to gh-pages from @ nlmixr2/monolix2rx@5946afbbdb3e337f49e674cfdd79f756468c116c 🚀
</commit_message>
<xml_diff>
--- a/articles/mod-Word.docx
+++ b/articles/mod-Word.docx
@@ -67,7 +67,7 @@
         </w:rPr>
         <w:t xml:space="preserve">Figure </w:t>
       </w:r>
-      <w:bookmarkStart w:id="9280481c-4153-4725-9056-e488e68f7116" w:name="model_diagram"/>
+      <w:bookmarkStart w:id="1371e972-af52-4a70-b11e-f7a5ed2d88b1" w:name="model_diagram"/>
       <w:r>
         <w:rPr/>
         <w:t xml:space="preserve"/>
@@ -88,7 +88,7 @@
         <w:rPr/>
         <w:t xml:space="preserve"/>
       </w:r>
-      <w:bookmarkEnd w:id="9280481c-4153-4725-9056-e488e68f7116"/>
+      <w:bookmarkEnd w:id="1371e972-af52-4a70-b11e-f7a5ed2d88b1"/>
       <w:r>
         <w:rPr>
           <w:rFonts/>
@@ -912,7 +912,7 @@
         </w:rPr>
         <w:t xml:space="preserve">Table </w:t>
       </w:r>
-      <w:bookmarkStart w:id="d65a28a6-9c74-4940-b520-e1e248626cea" w:name="model_equations"/>
+      <w:bookmarkStart w:id="fb301b8b-b861-4e88-9b86-e2182e178e9f" w:name="model_equations"/>
       <w:r>
         <w:rPr/>
         <w:t xml:space="preserve"/>
@@ -933,7 +933,7 @@
         <w:rPr/>
         <w:t xml:space="preserve"/>
       </w:r>
-      <w:bookmarkEnd w:id="d65a28a6-9c74-4940-b520-e1e248626cea"/>
+      <w:bookmarkEnd w:id="fb301b8b-b861-4e88-9b86-e2182e178e9f"/>
       <w:r>
         <w:rPr>
           <w:rFonts/>
@@ -3331,7 +3331,7 @@
         </w:rPr>
         <w:t xml:space="preserve">Table </w:t>
       </w:r>
-      <w:bookmarkStart w:id="55f22f80-d281-4081-ac74-489e4b85afca" w:name="pest_table"/>
+      <w:bookmarkStart w:id="f22ffb88-bf5b-4349-97d3-c78327329d36" w:name="pest_table"/>
       <w:r>
         <w:rPr/>
         <w:t xml:space="preserve"/>
@@ -3352,7 +3352,7 @@
         <w:rPr/>
         <w:t xml:space="preserve"/>
       </w:r>
-      <w:bookmarkEnd w:id="55f22f80-d281-4081-ac74-489e4b85afca"/>
+      <w:bookmarkEnd w:id="f22ffb88-bf5b-4349-97d3-c78327329d36"/>
       <w:r>
         <w:rPr>
           <w:rFonts/>
@@ -3448,7 +3448,7 @@
         </w:rPr>
         <w:t xml:space="preserve">Figure </w:t>
       </w:r>
-      <w:bookmarkStart w:id="7764d0b0-ccad-4ea3-be79-6c1258eea2e0" w:name="ind_plots"/>
+      <w:bookmarkStart w:id="11d72f47-058d-49c5-9797-f72524540b39" w:name="ind_plots"/>
       <w:r>
         <w:rPr/>
         <w:t xml:space="preserve"/>
@@ -3469,7 +3469,7 @@
         <w:rPr/>
         <w:t xml:space="preserve"/>
       </w:r>
-      <w:bookmarkEnd w:id="7764d0b0-ccad-4ea3-be79-6c1258eea2e0"/>
+      <w:bookmarkEnd w:id="11d72f47-058d-49c5-9797-f72524540b39"/>
       <w:r>
         <w:rPr>
           <w:rFonts/>
@@ -3551,7 +3551,7 @@
         </w:rPr>
         <w:t xml:space="preserve">Figure </w:t>
       </w:r>
-      <w:bookmarkStart w:id="13b48533-845a-4661-bf8f-9d4c6607cb66" w:name="dv_vs_pred_ipred"/>
+      <w:bookmarkStart w:id="81d0250b-1ace-4869-b96d-e6f9b5f8684f" w:name="dv_vs_pred_ipred"/>
       <w:r>
         <w:rPr/>
         <w:t xml:space="preserve"/>
@@ -3572,7 +3572,7 @@
         <w:rPr/>
         <w:t xml:space="preserve"/>
       </w:r>
-      <w:bookmarkEnd w:id="13b48533-845a-4661-bf8f-9d4c6607cb66"/>
+      <w:bookmarkEnd w:id="81d0250b-1ace-4869-b96d-e6f9b5f8684f"/>
       <w:r>
         <w:rPr>
           <w:rFonts/>
@@ -3660,7 +3660,7 @@
         </w:rPr>
         <w:t xml:space="preserve">Figure </w:t>
       </w:r>
-      <w:bookmarkStart w:id="8ce26607-8b88-4484-85bf-3aafee587f9a" w:name="prm_vs_iteration"/>
+      <w:bookmarkStart w:id="b42eb426-e9cc-4693-9614-942204a7924f" w:name="prm_vs_iteration"/>
       <w:r>
         <w:rPr/>
         <w:t xml:space="preserve"/>
@@ -3681,7 +3681,7 @@
         <w:rPr/>
         <w:t xml:space="preserve"/>
       </w:r>
-      <w:bookmarkEnd w:id="8ce26607-8b88-4484-85bf-3aafee587f9a"/>
+      <w:bookmarkEnd w:id="b42eb426-e9cc-4693-9614-942204a7924f"/>
       <w:r>
         <w:rPr>
           <w:rFonts/>

</xml_diff>

<commit_message>
Deploying to gh-pages from @ nlmixr2/monolix2rx@cf569a9577f9d4b3096bf506f5a960cdb1404087 🚀
</commit_message>
<xml_diff>
--- a/articles/mod-Word.docx
+++ b/articles/mod-Word.docx
@@ -67,7 +67,7 @@
         </w:rPr>
         <w:t xml:space="preserve">Figure </w:t>
       </w:r>
-      <w:bookmarkStart w:id="1371e972-af52-4a70-b11e-f7a5ed2d88b1" w:name="model_diagram"/>
+      <w:bookmarkStart w:id="604e0f00-a570-4cef-81b1-865fae86476c" w:name="model_diagram"/>
       <w:r>
         <w:rPr/>
         <w:t xml:space="preserve"/>
@@ -88,7 +88,7 @@
         <w:rPr/>
         <w:t xml:space="preserve"/>
       </w:r>
-      <w:bookmarkEnd w:id="1371e972-af52-4a70-b11e-f7a5ed2d88b1"/>
+      <w:bookmarkEnd w:id="604e0f00-a570-4cef-81b1-865fae86476c"/>
       <w:r>
         <w:rPr>
           <w:rFonts/>
@@ -912,7 +912,7 @@
         </w:rPr>
         <w:t xml:space="preserve">Table </w:t>
       </w:r>
-      <w:bookmarkStart w:id="fb301b8b-b861-4e88-9b86-e2182e178e9f" w:name="model_equations"/>
+      <w:bookmarkStart w:id="71f04b62-4fb9-4f57-a013-7b5452df7aca" w:name="model_equations"/>
       <w:r>
         <w:rPr/>
         <w:t xml:space="preserve"/>
@@ -933,7 +933,7 @@
         <w:rPr/>
         <w:t xml:space="preserve"/>
       </w:r>
-      <w:bookmarkEnd w:id="fb301b8b-b861-4e88-9b86-e2182e178e9f"/>
+      <w:bookmarkEnd w:id="71f04b62-4fb9-4f57-a013-7b5452df7aca"/>
       <w:r>
         <w:rPr>
           <w:rFonts/>
@@ -3331,7 +3331,7 @@
         </w:rPr>
         <w:t xml:space="preserve">Table </w:t>
       </w:r>
-      <w:bookmarkStart w:id="f22ffb88-bf5b-4349-97d3-c78327329d36" w:name="pest_table"/>
+      <w:bookmarkStart w:id="10eacd06-548b-4318-aa86-e81f33b6ac0b" w:name="pest_table"/>
       <w:r>
         <w:rPr/>
         <w:t xml:space="preserve"/>
@@ -3352,7 +3352,7 @@
         <w:rPr/>
         <w:t xml:space="preserve"/>
       </w:r>
-      <w:bookmarkEnd w:id="f22ffb88-bf5b-4349-97d3-c78327329d36"/>
+      <w:bookmarkEnd w:id="10eacd06-548b-4318-aa86-e81f33b6ac0b"/>
       <w:r>
         <w:rPr>
           <w:rFonts/>
@@ -3448,7 +3448,7 @@
         </w:rPr>
         <w:t xml:space="preserve">Figure </w:t>
       </w:r>
-      <w:bookmarkStart w:id="11d72f47-058d-49c5-9797-f72524540b39" w:name="ind_plots"/>
+      <w:bookmarkStart w:id="a0be05d2-7e69-4e84-b7ad-3a96a8d02ef6" w:name="ind_plots"/>
       <w:r>
         <w:rPr/>
         <w:t xml:space="preserve"/>
@@ -3469,7 +3469,7 @@
         <w:rPr/>
         <w:t xml:space="preserve"/>
       </w:r>
-      <w:bookmarkEnd w:id="11d72f47-058d-49c5-9797-f72524540b39"/>
+      <w:bookmarkEnd w:id="a0be05d2-7e69-4e84-b7ad-3a96a8d02ef6"/>
       <w:r>
         <w:rPr>
           <w:rFonts/>
@@ -3551,7 +3551,7 @@
         </w:rPr>
         <w:t xml:space="preserve">Figure </w:t>
       </w:r>
-      <w:bookmarkStart w:id="81d0250b-1ace-4869-b96d-e6f9b5f8684f" w:name="dv_vs_pred_ipred"/>
+      <w:bookmarkStart w:id="c9c31651-005a-4d78-b262-dfff437cdee4" w:name="dv_vs_pred_ipred"/>
       <w:r>
         <w:rPr/>
         <w:t xml:space="preserve"/>
@@ -3572,7 +3572,7 @@
         <w:rPr/>
         <w:t xml:space="preserve"/>
       </w:r>
-      <w:bookmarkEnd w:id="81d0250b-1ace-4869-b96d-e6f9b5f8684f"/>
+      <w:bookmarkEnd w:id="c9c31651-005a-4d78-b262-dfff437cdee4"/>
       <w:r>
         <w:rPr>
           <w:rFonts/>
@@ -3660,7 +3660,7 @@
         </w:rPr>
         <w:t xml:space="preserve">Figure </w:t>
       </w:r>
-      <w:bookmarkStart w:id="b42eb426-e9cc-4693-9614-942204a7924f" w:name="prm_vs_iteration"/>
+      <w:bookmarkStart w:id="7a433afe-b9aa-4268-a9ed-99046b701e92" w:name="prm_vs_iteration"/>
       <w:r>
         <w:rPr/>
         <w:t xml:space="preserve"/>
@@ -3681,7 +3681,7 @@
         <w:rPr/>
         <w:t xml:space="preserve"/>
       </w:r>
-      <w:bookmarkEnd w:id="b42eb426-e9cc-4693-9614-942204a7924f"/>
+      <w:bookmarkEnd w:id="7a433afe-b9aa-4268-a9ed-99046b701e92"/>
       <w:r>
         <w:rPr>
           <w:rFonts/>

</xml_diff>

<commit_message>
Deploying to gh-pages from @ nlmixr2/monolix2rx@69ed22f29291cee91422748639175e0ae8cb8fb2 🚀
</commit_message>
<xml_diff>
--- a/articles/mod-Word.docx
+++ b/articles/mod-Word.docx
@@ -67,7 +67,7 @@
         </w:rPr>
         <w:t xml:space="preserve">Figure </w:t>
       </w:r>
-      <w:bookmarkStart w:id="604e0f00-a570-4cef-81b1-865fae86476c" w:name="model_diagram"/>
+      <w:bookmarkStart w:id="1e6df768-7378-4a96-910f-766dc7b74ecc" w:name="model_diagram"/>
       <w:r>
         <w:rPr/>
         <w:t xml:space="preserve"/>
@@ -88,7 +88,7 @@
         <w:rPr/>
         <w:t xml:space="preserve"/>
       </w:r>
-      <w:bookmarkEnd w:id="604e0f00-a570-4cef-81b1-865fae86476c"/>
+      <w:bookmarkEnd w:id="1e6df768-7378-4a96-910f-766dc7b74ecc"/>
       <w:r>
         <w:rPr>
           <w:rFonts/>
@@ -912,7 +912,7 @@
         </w:rPr>
         <w:t xml:space="preserve">Table </w:t>
       </w:r>
-      <w:bookmarkStart w:id="71f04b62-4fb9-4f57-a013-7b5452df7aca" w:name="model_equations"/>
+      <w:bookmarkStart w:id="82fd81f7-4e88-4b29-9eef-f1f510572981" w:name="model_equations"/>
       <w:r>
         <w:rPr/>
         <w:t xml:space="preserve"/>
@@ -933,7 +933,7 @@
         <w:rPr/>
         <w:t xml:space="preserve"/>
       </w:r>
-      <w:bookmarkEnd w:id="71f04b62-4fb9-4f57-a013-7b5452df7aca"/>
+      <w:bookmarkEnd w:id="82fd81f7-4e88-4b29-9eef-f1f510572981"/>
       <w:r>
         <w:rPr>
           <w:rFonts/>
@@ -3331,7 +3331,7 @@
         </w:rPr>
         <w:t xml:space="preserve">Table </w:t>
       </w:r>
-      <w:bookmarkStart w:id="10eacd06-548b-4318-aa86-e81f33b6ac0b" w:name="pest_table"/>
+      <w:bookmarkStart w:id="b5dfccdf-3266-401a-a7cc-ee136c774d55" w:name="pest_table"/>
       <w:r>
         <w:rPr/>
         <w:t xml:space="preserve"/>
@@ -3352,7 +3352,7 @@
         <w:rPr/>
         <w:t xml:space="preserve"/>
       </w:r>
-      <w:bookmarkEnd w:id="10eacd06-548b-4318-aa86-e81f33b6ac0b"/>
+      <w:bookmarkEnd w:id="b5dfccdf-3266-401a-a7cc-ee136c774d55"/>
       <w:r>
         <w:rPr>
           <w:rFonts/>
@@ -3448,7 +3448,7 @@
         </w:rPr>
         <w:t xml:space="preserve">Figure </w:t>
       </w:r>
-      <w:bookmarkStart w:id="a0be05d2-7e69-4e84-b7ad-3a96a8d02ef6" w:name="ind_plots"/>
+      <w:bookmarkStart w:id="7fac5caf-de12-4a9b-8b18-16d28998c6ad" w:name="ind_plots"/>
       <w:r>
         <w:rPr/>
         <w:t xml:space="preserve"/>
@@ -3469,7 +3469,7 @@
         <w:rPr/>
         <w:t xml:space="preserve"/>
       </w:r>
-      <w:bookmarkEnd w:id="a0be05d2-7e69-4e84-b7ad-3a96a8d02ef6"/>
+      <w:bookmarkEnd w:id="7fac5caf-de12-4a9b-8b18-16d28998c6ad"/>
       <w:r>
         <w:rPr>
           <w:rFonts/>
@@ -3551,7 +3551,7 @@
         </w:rPr>
         <w:t xml:space="preserve">Figure </w:t>
       </w:r>
-      <w:bookmarkStart w:id="c9c31651-005a-4d78-b262-dfff437cdee4" w:name="dv_vs_pred_ipred"/>
+      <w:bookmarkStart w:id="a8d92e93-6602-4300-a9b4-1d91d7a3ea2e" w:name="dv_vs_pred_ipred"/>
       <w:r>
         <w:rPr/>
         <w:t xml:space="preserve"/>
@@ -3572,7 +3572,7 @@
         <w:rPr/>
         <w:t xml:space="preserve"/>
       </w:r>
-      <w:bookmarkEnd w:id="c9c31651-005a-4d78-b262-dfff437cdee4"/>
+      <w:bookmarkEnd w:id="a8d92e93-6602-4300-a9b4-1d91d7a3ea2e"/>
       <w:r>
         <w:rPr>
           <w:rFonts/>
@@ -3660,7 +3660,7 @@
         </w:rPr>
         <w:t xml:space="preserve">Figure </w:t>
       </w:r>
-      <w:bookmarkStart w:id="7a433afe-b9aa-4268-a9ed-99046b701e92" w:name="prm_vs_iteration"/>
+      <w:bookmarkStart w:id="9ade686e-872f-42b5-8cb4-31ae6dc5b8cc" w:name="prm_vs_iteration"/>
       <w:r>
         <w:rPr/>
         <w:t xml:space="preserve"/>
@@ -3681,7 +3681,7 @@
         <w:rPr/>
         <w:t xml:space="preserve"/>
       </w:r>
-      <w:bookmarkEnd w:id="7a433afe-b9aa-4268-a9ed-99046b701e92"/>
+      <w:bookmarkEnd w:id="9ade686e-872f-42b5-8cb4-31ae6dc5b8cc"/>
       <w:r>
         <w:rPr>
           <w:rFonts/>

</xml_diff>